<commit_message>
Redesign survey to 17 questions after field feedback (was 33)
Direct feedback: the 33-question draft was too long to realistically
get completed on a WhatsApp-forwarded link, and over-fitted to two
named cities (Hyderabad, Visakhapatnam). Rebuilds the same document
(no new file) around a harder bar: every surviving question must map
to a rail (Voice / Payments & Authorisation / Logistics) or one of the
competition's own 10 answers, per the narrowing strategy already in
narrowed_problem.md/research_plan.md. Collapses the four chained
decision-role sub-questions into a single grid question, merges
consent+age into one checkbox, drops city/community-specific framing
and screening entirely (now generic to any city), and cuts anything
better covered by the team's own live interviews. 33 -> 17 questions,
~7-9 min -> ~3-4 min estimated completion time.

Co-Authored-By: Claude Sonnet 5 <noreply@anthropic.com>
Claude-Session: https://claude.ai/code/session_01LYHzkE42Pd4RXp98AtGSga
</commit_message>
<xml_diff>
--- a/output/docx/Ken_2026_Household_Survey_Google_Form_Guide.docx
+++ b/output/docx/Ken_2026_Household_Survey_Google_Form_Guide.docx
@@ -49,7 +49,7 @@
           <w:color w:val="555555"/>
           <w:sz w:val="22"/>
         </w:rPr>
-        <w:t>A ready-to-copy Google Form script for residents of Hyderabad and Visakhapatnam gated communities, with the WhatsApp circulation message, the false-positive screening strategy, and the two cognitive pilot tests that shaped it.</w:t>
+        <w:t>17 questions, one screen at a time, built to actually get finished. Every question is mapped to a rail (Voice / Payments &amp; Authorisation / Logistics) or one of the competition's own 10 answers — nothing generic, nothing that doesn't move a real decision.</w:t>
       </w:r>
     </w:p>
     <w:p/>
@@ -62,7 +62,7 @@
           <w:color w:val="555555"/>
           <w:sz w:val="20"/>
         </w:rPr>
-        <w:t>Estimated respondent time: about 5 minutes for an eligible respondent, under a minute for someone screened out early.</w:t>
+        <w:t>Estimated respondent time: about 3-4 minutes. Works for any city, any community — nothing here is Hyderabad/Visakhapatnam-specific.</w:t>
       </w:r>
     </w:p>
     <w:p>
@@ -83,7 +83,7 @@
         <w:pStyle w:val="ListNumber"/>
       </w:pPr>
       <w:r>
-        <w:t>Part 1 — How this survey was researched and designed</w:t>
+        <w:t>Part 1 — Why this was cut from 33 questions to 17, and the rules that kept it short</w:t>
       </w:r>
     </w:p>
     <w:p>
@@ -91,7 +91,7 @@
         <w:pStyle w:val="ListNumber"/>
       </w:pPr>
       <w:r>
-        <w:t>Part 2 — Screening strategy: keeping out false positives</w:t>
+        <w:t>Part 2 — Every question mapped to a rail or a competition answer</w:t>
       </w:r>
     </w:p>
     <w:p>
@@ -99,7 +99,7 @@
         <w:pStyle w:val="ListNumber"/>
       </w:pPr>
       <w:r>
-        <w:t>Part 3 — The WhatsApp message to circulate</w:t>
+        <w:t>Part 3 — Screening: keeping the data honest without adding friction</w:t>
       </w:r>
     </w:p>
     <w:p>
@@ -107,7 +107,7 @@
         <w:pStyle w:val="ListNumber"/>
       </w:pPr>
       <w:r>
-        <w:t>Part 4 — The Google Form, section by section, exactly as to build it</w:t>
+        <w:t>Part 4 — The WhatsApp message to circulate</w:t>
       </w:r>
     </w:p>
     <w:p>
@@ -115,7 +115,7 @@
         <w:pStyle w:val="ListNumber"/>
       </w:pPr>
       <w:r>
-        <w:t>Part 5 — How we tested it: two cognitive pilots, and what changed</w:t>
+        <w:t>Part 5 — The Google Form, exactly as to build it</w:t>
       </w:r>
     </w:p>
     <w:p>
@@ -131,7 +131,7 @@
         <w:pStyle w:val="ListNumber"/>
       </w:pPr>
       <w:r>
-        <w:t>Appendix — Quantitative vs. qualitative map, and the two pilot personas</w:t>
+        <w:t>Appendix — What the earlier, longer draft's pilot tests taught us that still applies</w:t>
       </w:r>
     </w:p>
     <w:p>
@@ -144,12 +144,12 @@
         <w:pStyle w:val="Heading1"/>
       </w:pPr>
       <w:r>
-        <w:t>Part 1 — How this survey was researched and designed</w:t>
+        <w:t>Part 1 — Why this was cut from 33 questions to 17, and the rules that kept it short</w:t>
       </w:r>
     </w:p>
     <w:p>
       <w:r>
-        <w:t>This survey builds directly on the team's own already-audited S0-S30 instrument (research/report-source.md, cleared in best_practices.md's line-by-line review as "ship it") and a second, independent Google-Forms-ready pass a teammate already pushed (survey_guide.md). What this document adds: (1) a version written specifically for a self-administered, WhatsApp-distributed audience in Hyderabad and Visakhapatnam gated communities, mostly housewives, in plainer everyday English with every acronym explained; (2) fresh, current external research on survey-question design, not just the team's internal textbook synthesis; (3) a real, documented WhatsApp circulation message; (4) an explicit false-positive screening strategy for open WhatsApp distribution; and (5) two simulated cognitive-pilot tests run before finalizing, in place of (or ahead of) the in-person pilots the team's own plan calls for.</w:t>
+        <w:t>The earlier draft of this survey ran to 33 questions. Real feedback on it was direct: nobody actually finishes a survey that long, especially one arriving as a WhatsApp link with no interviewer present to keep someone engaged. It was also over-fitted to two named cities (Hyderabad, Visakhapatnam) and specific gated communities, which made it feel like a local pilot rather than a survey that could travel anywhere the link is forwarded. This version rebuilds it around a harder constraint than "comprehensive": every question has to earn its place by moving one specific decision this team still has to make.</w:t>
       </w:r>
     </w:p>
     <w:p>
@@ -157,7 +157,7 @@
         <w:pStyle w:val="Heading2"/>
       </w:pPr>
       <w:r>
-        <w:t>What the team's internal research already established</w:t>
+        <w:t>The rules applied to cut 33 down to 17</w:t>
       </w:r>
     </w:p>
     <w:p>
@@ -165,7 +165,7 @@
         <w:pStyle w:val="ListBullet"/>
       </w:pPr>
       <w:r>
-        <w:t>Ask about one recent incident before opinions; ask one concept at a time; offer "cannot recall / not applicable" wherever it is meaningful; keep open questions before the closed questions that could prime them (best_practices.md — Pew's own questionnaire guidance, cited directly).</w:t>
+        <w:t>Cut anything a live interview already covers in more depth. This project runs 6-9 real interviews — the survey's job is breadth (quick counts across many people) and a couple of genuinely surprising open answers, not re-collecting interview-depth detail from strangers on WhatsApp. Precise minute counts and rupee amounts were dropped for exactly this reason — the interviews already ask for them properly, with a real person able to help the respondent recall.</w:t>
       </w:r>
     </w:p>
     <w:p>
@@ -173,7 +173,7 @@
         <w:pStyle w:val="ListBullet"/>
       </w:pPr>
       <w:r>
-        <w:t>A convenience sample recruited off WhatsApp licenses claims about mechanism, never about prevalence — state the limitation plainly rather than imply representativeness.</w:t>
+        <w:t>Collapse any "chain" of related sub-questions into one grid question. Where the earlier draft asked who decided, who approved the cost, who paid, and who let the technician in as four separate questions in a row, this version asks all four as the rows of a single grid — one screen, four fast taps, not four separate decisions to sit through.</w:t>
       </w:r>
     </w:p>
     <w:p>
@@ -181,7 +181,7 @@
         <w:pStyle w:val="ListBullet"/>
       </w:pPr>
       <w:r>
-        <w:t>Zero double-barreled or leading questions were found in the team's original S0-S30 pass — this document holds itself to the same bar for every new or reworded question below.</w:t>
+        <w:t>Combine consent and the age check into a single required checkbox instead of two separate questions — this alone removes two full screens from every respondent's path.</w:t>
       </w:r>
     </w:p>
     <w:p>
@@ -189,15 +189,7 @@
         <w:pStyle w:val="ListBullet"/>
       </w:pPr>
       <w:r>
-        <w:t>A stated preference ("which action would you want handled") is weaker evidence than a reported past behavior — label preference questions honestly as such, don't treat them as demonstrated adoption.</w:t>
-      </w:r>
-    </w:p>
-    <w:p>
-      <w:pPr>
-        <w:pStyle w:val="Heading2"/>
-      </w:pPr>
-      <w:r>
-        <w:t>Fresh external research pulled in for this pass</w:t>
+        <w:t>Remove every question that doesn't map to a rail or one of the competition's own 10 answers — see Part 2's table. If a question couldn't be pointed at a specific answer it would change, it was cut, no matter how interesting it might have been in the abstract.</w:t>
       </w:r>
     </w:p>
     <w:p>
@@ -205,7 +197,7 @@
         <w:pStyle w:val="ListBullet"/>
       </w:pPr>
       <w:r>
-        <w:t>Pew Research Center, "Writing Survey Questions": ask only one thing per question — a question that quietly evaluates two concepts at once (a double-barreled question) is hard to answer and harder to interpret; use simple, concrete language, especially given the target population's range of English fluency.</w:t>
+        <w:t>Remove every Hyderabad/Visakhapatnam-specific element — no named-community field, no city-restricted dropdown, no city-specific screening logic. City is one open text field; the WhatsApp message names no city at all. The same form now works wherever it's shared.</w:t>
       </w:r>
     </w:p>
     <w:p>
@@ -213,36 +205,12 @@
         <w:pStyle w:val="ListBullet"/>
       </w:pPr>
       <w:r>
-        <w:t>Qualtrics, "The Dreaded Double-Barreled Question": the fix for a double-barreled question is not a better single sentence — it is always two separate questions.</w:t>
-      </w:r>
-    </w:p>
-    <w:p>
-      <w:pPr>
-        <w:pStyle w:val="ListBullet"/>
-      </w:pPr>
-      <w:r>
-        <w:t>Alchemer / SurveyMonkey / AAPOR guidance on question ordering: general questions before specific ones on the same topic; open-ended questions late, but not so late that fatigue causes drop-off; screening questions to qualify or disqualify respondents before they answer questions that do not apply to them, which reduces sampling bias toward the intended population.</w:t>
-      </w:r>
-    </w:p>
-    <w:p>
-      <w:pPr>
-        <w:pStyle w:val="ListBullet"/>
-      </w:pPr>
-      <w:r>
-        <w:t>Practical guidance on Google Forms and WhatsApp-distributed surveys: Google Forms can require sign-in and limit each Google account to one response, which helps deduplicate responses but breaks an anonymity promise and reduces willingness to respond when a link is being forwarded person-to-person in a community group — the practical alternative is to stay anonymous and catch duplicates at the analysis stage instead (see Part 2).</w:t>
-      </w:r>
-    </w:p>
-    <w:p>
-      <w:pPr>
-        <w:pStyle w:val="Heading2"/>
-      </w:pPr>
-      <w:r>
-        <w:t>What this document adds on top of all of that</w:t>
+        <w:t>Almost everything is now a single tap. Only two genuinely open questions remain (Part 5, Section 3), placed together and clearly optional, instead of four paragraph boxes scattered through a much longer form.</w:t>
       </w:r>
     </w:p>
     <w:p>
       <w:r>
-        <w:t>A single, sequenced script sized for a genuinely short (about 5-minute) self-administered form, in language simple enough for a non-fluent-English housewife respondent, with every acronym spelled out on first use, an explicit tie-breaking rule for the single most common real-world ambiguity (two candidate incidents in the same week), and a documented, tested WhatsApp message — built and then pressure-tested with two simulated respondents before being finalized, exactly the way the household interview guide was.</w:t>
+        <w:t>This is not a smaller version of the same survey with weaker data — it is a different design choice, made explicitly: a short survey that a real fraction of people actually finish is worth more than a comprehensive one that almost nobody does. The 5 principles from external survey-design research used in the earlier pass still hold and are respected throughout (one concept per question, open questions before questions that could prime them, "don't know/not sure" offered wherever it's meaningful, no double-barreled questions, screening before asking questions that don't apply) — what changed is scope, not rigor.</w:t>
       </w:r>
     </w:p>
     <w:p>
@@ -250,1490 +218,12 @@
         <w:pStyle w:val="Heading1"/>
       </w:pPr>
       <w:r>
-        <w:t>Part 2 — Screening strategy: keeping out false positives</w:t>
+        <w:t>Part 2 — Every question mapped to a rail or a competition answer</w:t>
       </w:r>
     </w:p>
     <w:p>
       <w:r>
-        <w:t>Floating this survey into open WhatsApp groups means the link can travel well beyond the specific gated communities it was meant for — forwarded on, posted in an unrelated group, or filled in by someone who does not actually live there or never actually had a real incident. "False positives" here means exactly that: a response that looks eligible on the surface but is not a genuine, in-scope respondent. Three layers handle this, none of which require turning off anonymity:</w:t>
-      </w:r>
-    </w:p>
-    <w:p>
-      <w:pPr>
-        <w:pStyle w:val="Heading2"/>
-      </w:pPr>
-      <w:r>
-        <w:t>Layer 1 — Eligibility screening built into the form itself</w:t>
-      </w:r>
-    </w:p>
-    <w:p>
-      <w:pPr>
-        <w:pStyle w:val="ListBullet"/>
-      </w:pPr>
-      <w:r>
-        <w:t>Q2 (age 18+) and Q6 (a genuine incident in the last 90 days) are hard gates — anyone who fails either is routed straight to the short demographics block and the end, never seeing the incident questions at all. This is the standard screening-question technique: it does not stop a false respondent from opening the form, but it stops them from generating incident data that would contaminate the real dataset.</w:t>
-      </w:r>
-    </w:p>
-    <w:p>
-      <w:pPr>
-        <w:pStyle w:val="ListBullet"/>
-      </w:pPr>
-      <w:r>
-        <w:t>Q5's coordinator-role question and Q7-Q12's level of specific, hard-to-fabricate detail (which appliance, how contact was made, what was actually done) make a low-effort or fabricated response visibly thinner and more generic than a real one at the analysis stage — a genuine respondent's answers cohere with each other; an invented one usually does not.</w:t>
-      </w:r>
-    </w:p>
-    <w:p>
-      <w:pPr>
-        <w:pStyle w:val="Heading2"/>
-      </w:pPr>
-      <w:r>
-        <w:t>Layer 2 — Community/location plausibility (addressing "check this against Google Maps")</w:t>
-      </w:r>
-    </w:p>
-    <w:p>
-      <w:r>
-        <w:t>Google Forms has no native Google Maps integration, so this cannot be automated inside the form itself — but the same goal is achievable as a manual post-collection check, and Q4 and Q3 are designed specifically to make that possible:</w:t>
-      </w:r>
-    </w:p>
-    <w:p>
-      <w:pPr>
-        <w:pStyle w:val="ListBullet"/>
-      </w:pPr>
-      <w:r>
-        <w:t>Q4 asks for the specific apartment community/building name (optional, but encouraged, with a one-line reassurance about why it is asked). After collection, cross-check a sample of the named communities against Google Maps to confirm they are real, existing gated communities in the stated city (Q3) — a response naming a community that does not exist, or that is in a completely different city than claimed, is a strong signal of a false positive or a joke/test response, and should be flagged and excluded before analysis.</w:t>
-      </w:r>
-    </w:p>
-    <w:p>
-      <w:pPr>
-        <w:pStyle w:val="ListBullet"/>
-      </w:pPr>
-      <w:r>
-        <w:t>This is a lightweight, honest verification step, not a hard filter at submission time — it deliberately does not block or reject anyone while they are filling out the form (which would also block genuine respondents who skip the optional Q4), it only flags implausible responses afterward, when a human reviews the response sheet.</w:t>
-      </w:r>
-    </w:p>
-    <w:p>
-      <w:pPr>
-        <w:ind w:left="432"/>
-      </w:pPr>
-      <w:r>
-        <w:rPr>
-          <w:i/>
-          <w:color w:val="555555"/>
-          <w:sz w:val="20"/>
-        </w:rPr>
-        <w:t>If what was actually meant by checking this "through Google Maps" was something more specific (for example, verifying respondents via a shared location pin, or restricting the survey to certain areas), say so and this section can be adapted — the interpretation above is the most workable version given what a Google Form can actually do without paid add-ons or custom scripting.</w:t>
-      </w:r>
-    </w:p>
-    <w:p>
-      <w:pPr>
-        <w:pStyle w:val="Heading2"/>
-      </w:pPr>
-      <w:r>
-        <w:t>Layer 3 — Duplicate/low-quality response detection at analysis time</w:t>
-      </w:r>
-    </w:p>
-    <w:p>
-      <w:pPr>
-        <w:pStyle w:val="ListBullet"/>
-      </w:pPr>
-      <w:r>
-        <w:t>Do not enable Google Forms' "Limit to 1 response" (which forces Google sign-in) — it breaks the anonymity promise made in the form description and will visibly reduce response rates from people who are, correctly, cautious about signing into an unknown form. The team's own earlier survey design already made this same call for the same reason.</w:t>
-      </w:r>
-    </w:p>
-    <w:p>
-      <w:pPr>
-        <w:pStyle w:val="ListBullet"/>
-      </w:pPr>
-      <w:r>
-        <w:t>Instead, once responses are collected: sort by timestamp and flag any unusually tight burst of near-identical responses (a classic sign of one person submitting multiple times, or a small group filling it in together as a joke); flag any response that completes the entire form implausibly fast (a genuine respondent completing every question, including the open-text ones, in under 60 seconds is unlikely); and flag any open-text answer that is an exact or near-exact duplicate of another response's open-text answer.</w:t>
-      </w:r>
-    </w:p>
-    <w:p>
-      <w:pPr>
-        <w:pStyle w:val="ListBullet"/>
-      </w:pPr>
-      <w:r>
-        <w:t>Keep a simple exclusion log (which responses were dropped, and why) rather than silently deleting rows — this is the same evidence-honesty discipline the team's interview work already follows.</w:t>
-      </w:r>
-    </w:p>
-    <w:p>
-      <w:r>
-        <w:br w:type="page"/>
-      </w:r>
-    </w:p>
-    <w:p>
-      <w:pPr>
-        <w:pStyle w:val="Heading1"/>
-      </w:pPr>
-      <w:r>
-        <w:t>Part 3 — The WhatsApp message to circulate</w:t>
-      </w:r>
-    </w:p>
-    <w:p>
-      <w:r>
-        <w:t>Paste this directly into the community/apartment WhatsApp groups.</w:t>
-      </w:r>
-    </w:p>
-    <w:p>
-      <w:pPr>
-        <w:spacing w:after="160"/>
-        <w:ind w:left="432"/>
-      </w:pPr>
-      <w:r>
-        <w:rPr>
-          <w:i/>
-          <w:color w:val="1F2A44"/>
-          <w:sz w:val="22"/>
-        </w:rPr>
-        <w:t>“Hi everyone! We're a student team from IIIT Hyderabad (Team Invictus), and we're doing a short study on how families in apartment communities like ours handle getting things repaired or serviced at home — things like the AC, fridge, washing machine, geyser, water purifier, and so on.</w:t>
-        <w:br/>
-        <w:br/>
-        <w:t>We'd really appreciate 5 minutes of your time to fill this out: [FORM LINK HERE]</w:t>
-        <w:br/>
-        <w:br/>
-        <w:t>A few quick things before you click:</w:t>
-        <w:br/>
-        <w:t>- It's completely anonymous. We don't ask for your name — only your rough age group and city.</w:t>
-        <w:br/>
-        <w:t>- It's voluntary. Feel free to skip any question, or stop anytime.</w:t>
-        <w:br/>
-        <w:t>- We are NOT selling anything, and we will NEVER ask for money, OTP, or bank details.</w:t>
-        <w:br/>
-        <w:t>- This is for a genuine student research project (a national case competition), not a company or marketing survey.</w:t>
-        <w:br/>
-        <w:br/>
-        <w:t>If anyone else in the building would be willing to fill it out too, please do forward this message along — the more responses, the better our study.</w:t>
-        <w:br/>
-        <w:br/>
-        <w:t>Happy to answer any questions here, or you can reach us at [phone/email].</w:t>
-        <w:br/>
-        <w:br/>
-        <w:t>Thank you so much!</w:t>
-        <w:br/>
-        <w:t>— [Your name], on behalf of Team Invictus, IIIT Hyderabad”</w:t>
-      </w:r>
-    </w:p>
-    <w:p>
-      <w:r>
-        <w:rPr>
-          <w:b/>
-        </w:rPr>
-        <w:t xml:space="preserve">Optional shorter version, for a reminder post a few days later: </w:t>
-      </w:r>
-    </w:p>
-    <w:p>
-      <w:pPr>
-        <w:spacing w:after="160"/>
-        <w:ind w:left="432"/>
-      </w:pPr>
-      <w:r>
-        <w:rPr>
-          <w:i/>
-          <w:color w:val="1F2A44"/>
-          <w:sz w:val="22"/>
-        </w:rPr>
-        <w:t>“Hi again — just a gentle reminder about the short survey on household appliance repairs/servicing we shared earlier this week: [FORM LINK HERE]. Takes about 5 minutes, fully anonymous, and really helps our student research project. Thank you to everyone who's already filled it out!”</w:t>
-      </w:r>
-    </w:p>
-    <w:p>
-      <w:r>
-        <w:rPr>
-          <w:b/>
-        </w:rPr>
-        <w:t xml:space="preserve">Notes on posting this: </w:t>
-      </w:r>
-    </w:p>
-    <w:p>
-      <w:pPr>
-        <w:pStyle w:val="ListBullet"/>
-      </w:pPr>
-      <w:r>
-        <w:t>Post it yourself, or ask a resident you know in the group to post it — a message from a known, trusted resident is far more likely to be taken seriously than one from an unfamiliar number, especially in a group where unknown links are treated with suspicion.</w:t>
-      </w:r>
-    </w:p>
-    <w:p>
-      <w:pPr>
-        <w:pStyle w:val="ListBullet"/>
-      </w:pPr>
-      <w:r>
-        <w:t>If the group has an admin-approval step for links, give the admin a one-line heads-up first that this is a genuine student project, not an advertisement.</w:t>
-      </w:r>
-    </w:p>
-    <w:p>
-      <w:pPr>
-        <w:pStyle w:val="ListBullet"/>
-      </w:pPr>
-      <w:r>
-        <w:t>Avoid posting the link with no context into a group you are not already a known member of — that reads as spam regardless of intent, whatever the message says.</w:t>
-      </w:r>
-    </w:p>
-    <w:p>
-      <w:r>
-        <w:br w:type="page"/>
-      </w:r>
-    </w:p>
-    <w:p>
-      <w:pPr>
-        <w:pStyle w:val="Heading1"/>
-      </w:pPr>
-      <w:r>
-        <w:t>Part 4 — The Google Form, section by section</w:t>
-      </w:r>
-    </w:p>
-    <w:p>
-      <w:r>
-        <w:t>Copy this directly into Google Forms. Each “SECTION” below should be a Forms section (page break), not just a heading, wherever branching is noted.</w:t>
-      </w:r>
-    </w:p>
-    <w:p>
-      <w:pPr>
-        <w:pStyle w:val="Heading2"/>
-      </w:pPr>
-      <w:r>
-        <w:t>Form description (top of the form, before any question)</w:t>
-      </w:r>
-    </w:p>
-    <w:p>
-      <w:pPr>
-        <w:spacing w:after="160"/>
-        <w:ind w:left="432"/>
-      </w:pPr>
-      <w:r>
-        <w:rPr>
-          <w:i/>
-          <w:color w:val="1F2A44"/>
-          <w:sz w:val="22"/>
-        </w:rPr>
-        <w:t>“Hi! We are a student team (Invictus, IIIT Hyderabad) doing a short study on how families in apartment communities handle getting things repaired or serviced at home — things like the AC, fridge, washing machine, geyser, water purifier, and so on. This includes both breakdowns and routine things like a filter change or a gas top-up.</w:t>
-        <w:br/>
-        <w:br/>
-        <w:t>This survey takes about 5 minutes. It's completely voluntary — you can skip anything or stop anytime — and your answers are anonymous; we only keep your rough age group and city, never your name. Your anonymised answers may be used in a student case-competition submission (The Ken 2026) and, if selected, seen by the competition's judges.</w:t>
-        <w:br/>
-        <w:br/>
-        <w:t>We are not selling anything and we will never ask for money, OTPs, or bank details.</w:t>
-        <w:br/>
-        <w:t>Questions? Contact: [insert a real team phone/email before launch].”</w:t>
-      </w:r>
-    </w:p>
-    <w:p>
-      <w:pPr>
-        <w:pStyle w:val="Heading2"/>
-      </w:pPr>
-      <w:r>
-        <w:t>SECTION 1 — A couple of quick questions first</w:t>
-      </w:r>
-    </w:p>
-    <w:p>
-      <w:r>
-        <w:rPr>
-          <w:b/>
-        </w:rPr>
-        <w:t xml:space="preserve">Q1. </w:t>
-      </w:r>
-      <w:r>
-        <w:rPr>
-          <w:i/>
-          <w:color w:val="1F2A44"/>
-        </w:rPr>
-        <w:t>“Do you agree to answer this survey on the basis explained above?”</w:t>
-      </w:r>
-    </w:p>
-    <w:p>
-      <w:r>
-        <w:rPr>
-          <w:i/>
-          <w:color w:val="8A1F2B"/>
-          <w:sz w:val="20"/>
-        </w:rPr>
-        <w:t>Type: Multiple choice. Options: Yes / No.</w:t>
-      </w:r>
-    </w:p>
-    <w:p>
-      <w:r>
-        <w:rPr>
-          <w:i/>
-          <w:color w:val="8A1F2B"/>
-          <w:sz w:val="20"/>
-        </w:rPr>
-        <w:t>Branching: No — end of form.</w:t>
-      </w:r>
-    </w:p>
-    <w:p>
-      <w:r>
-        <w:rPr>
-          <w:b/>
-        </w:rPr>
-        <w:t xml:space="preserve">Q2. </w:t>
-      </w:r>
-      <w:r>
-        <w:rPr>
-          <w:i/>
-          <w:color w:val="1F2A44"/>
-        </w:rPr>
-        <w:t>“Are you 18 years or older?”</w:t>
-      </w:r>
-    </w:p>
-    <w:p>
-      <w:r>
-        <w:rPr>
-          <w:i/>
-          <w:color w:val="8A1F2B"/>
-          <w:sz w:val="20"/>
-        </w:rPr>
-        <w:t>Type: Multiple choice. Options: Yes / No / Would rather not say.</w:t>
-      </w:r>
-    </w:p>
-    <w:p>
-      <w:r>
-        <w:rPr>
-          <w:i/>
-          <w:color w:val="8A1F2B"/>
-          <w:sz w:val="20"/>
-        </w:rPr>
-        <w:t>Branching: Only Yes continues.</w:t>
-      </w:r>
-    </w:p>
-    <w:p>
-      <w:r>
-        <w:rPr>
-          <w:b/>
-        </w:rPr>
-        <w:t xml:space="preserve">Q3. </w:t>
-      </w:r>
-      <w:r>
-        <w:rPr>
-          <w:i/>
-          <w:color w:val="1F2A44"/>
-        </w:rPr>
-        <w:t>“Which city do you currently live in?”</w:t>
-      </w:r>
-    </w:p>
-    <w:p>
-      <w:r>
-        <w:rPr>
-          <w:i/>
-          <w:color w:val="8A1F2B"/>
-          <w:sz w:val="20"/>
-        </w:rPr>
-        <w:t>Type: Multiple choice. Options: Hyderabad / Visakhapatnam / Other (please type).</w:t>
-      </w:r>
-    </w:p>
-    <w:p>
-      <w:r>
-        <w:rPr>
-          <w:b/>
-        </w:rPr>
-        <w:t xml:space="preserve">Q4. </w:t>
-      </w:r>
-      <w:r>
-        <w:rPr>
-          <w:i/>
-          <w:color w:val="1F2A44"/>
-        </w:rPr>
-        <w:t>“What is the name of your apartment community/building?”</w:t>
-      </w:r>
-    </w:p>
-    <w:p>
-      <w:r>
-        <w:rPr>
-          <w:i/>
-          <w:color w:val="8A1F2B"/>
-          <w:sz w:val="20"/>
-        </w:rPr>
-        <w:t>Type: Short answer, optional.</w:t>
-      </w:r>
-    </w:p>
-    <w:p>
-      <w:pPr>
-        <w:ind w:left="432"/>
-      </w:pPr>
-      <w:r>
-        <w:rPr>
-          <w:i/>
-          <w:color w:val="555555"/>
-          <w:sz w:val="20"/>
-        </w:rPr>
-        <w:t>This just helps us understand which areas we're reaching — it won't be shared with anyone, and it's fine to skip.</w:t>
-      </w:r>
-    </w:p>
-    <w:p>
-      <w:r>
-        <w:rPr>
-          <w:b/>
-        </w:rPr>
-        <w:t xml:space="preserve">Q5. </w:t>
-      </w:r>
-      <w:r>
-        <w:rPr>
-          <w:i/>
-          <w:color w:val="1F2A44"/>
-        </w:rPr>
-        <w:t>“In your home, who usually deals with getting things repaired or serviced — calling someone, following up, and so on?”</w:t>
-      </w:r>
-    </w:p>
-    <w:p>
-      <w:r>
-        <w:rPr>
-          <w:i/>
-          <w:color w:val="8A1F2B"/>
-          <w:sz w:val="20"/>
-        </w:rPr>
-        <w:t>Type: Multiple choice. Options: I usually do it myself / Someone else in my home usually does it, but I know what happens / I don't really know much about this in my home.</w:t>
-      </w:r>
-    </w:p>
-    <w:p>
-      <w:r>
-        <w:rPr>
-          <w:b/>
-        </w:rPr>
-        <w:t xml:space="preserve">Q6. </w:t>
-      </w:r>
-      <w:r>
-        <w:rPr>
-          <w:i/>
-          <w:color w:val="1F2A44"/>
-        </w:rPr>
-        <w:t>“In the last 3 months, were you personally involved in getting any appliance or home service fixed, serviced, or newly installed — this includes routine things like a filter change or gas top-up, not just breakdowns?”</w:t>
-      </w:r>
-    </w:p>
-    <w:p>
-      <w:r>
-        <w:rPr>
-          <w:i/>
-          <w:color w:val="8A1F2B"/>
-          <w:sz w:val="20"/>
-        </w:rPr>
-        <w:t>Type: Multiple choice. Options: Yes / No / Not sure.</w:t>
-      </w:r>
-    </w:p>
-    <w:p>
-      <w:r>
-        <w:rPr>
-          <w:i/>
-          <w:color w:val="8A1F2B"/>
-          <w:sz w:val="20"/>
-        </w:rPr>
-        <w:t>Branching: No/Not sure — skip to Section 7 (About you), then end. Yes — continue to Section 2.</w:t>
-      </w:r>
-    </w:p>
-    <w:p>
-      <w:pPr>
-        <w:pStyle w:val="Heading2"/>
-      </w:pPr>
-      <w:r>
-        <w:t>SECTION 2 — Tell us about one specific time</w:t>
-      </w:r>
-    </w:p>
-    <w:p>
-      <w:pPr>
-        <w:ind w:left="432"/>
-      </w:pPr>
-      <w:r>
-        <w:rPr>
-          <w:i/>
-          <w:color w:val="555555"/>
-          <w:sz w:val="20"/>
-        </w:rPr>
-        <w:t>Intro text shown to the respondent: Think about the most recent time in the last 3 months that you personally were involved in getting an appliance or home service repaired, serviced, or installed. If more than one thing happened around the same time — say, two different things in the same week — please pick whichever one happened last, even if it was only a day or two after the other. It doesn't need to be the bigger or more complicated one. Please keep that one specific time in mind for all the questions below.</w:t>
-      </w:r>
-    </w:p>
-    <w:p>
-      <w:r>
-        <w:rPr>
-          <w:b/>
-        </w:rPr>
-        <w:t xml:space="preserve">Q7. </w:t>
-      </w:r>
-      <w:r>
-        <w:rPr>
-          <w:i/>
-          <w:color w:val="1F2A44"/>
-        </w:rPr>
-        <w:t>“Which appliance or service was this about?”</w:t>
-      </w:r>
-    </w:p>
-    <w:p>
-      <w:r>
-        <w:rPr>
-          <w:i/>
-          <w:color w:val="8A1F2B"/>
-          <w:sz w:val="20"/>
-        </w:rPr>
-        <w:t>Type: Multiple choice, Other allows free text. Options: AC / Fridge / Washing machine / Water purifier / Geyser / Kitchen appliance (mixer, chimney, etc.) / Some other home service (pest control, plumbing, electrical) / Other.</w:t>
-      </w:r>
-    </w:p>
-    <w:p>
-      <w:r>
-        <w:rPr>
-          <w:b/>
-        </w:rPr>
-        <w:t xml:space="preserve">Q8. </w:t>
-      </w:r>
-      <w:r>
-        <w:rPr>
-          <w:i/>
-          <w:color w:val="1F2A44"/>
-        </w:rPr>
-        <w:t>“What was the situation?”</w:t>
-      </w:r>
-    </w:p>
-    <w:p>
-      <w:r>
-        <w:rPr>
-          <w:i/>
-          <w:color w:val="8A1F2B"/>
-          <w:sz w:val="20"/>
-        </w:rPr>
-        <w:t>Type: Multiple choice, Other free text. Options: It stopped working completely / It wasn't working as well as before (for example, not cooling properly, or weak water flow) / New installation / Regular yearly service / Routine maintenance or top-up, nothing broken (like a filter change or gas refill) / Following up on an earlier repair that didn't fully work / Other / Don't remember.</w:t>
-      </w:r>
-    </w:p>
-    <w:p>
-      <w:r>
-        <w:rPr>
-          <w:b/>
-        </w:rPr>
-        <w:t xml:space="preserve">Q9. </w:t>
-      </w:r>
-      <w:r>
-        <w:rPr>
-          <w:i/>
-          <w:color w:val="1F2A44"/>
-        </w:rPr>
-        <w:t>“Roughly when did this happen?”</w:t>
-      </w:r>
-    </w:p>
-    <w:p>
-      <w:r>
-        <w:rPr>
-          <w:i/>
-          <w:color w:val="8A1F2B"/>
-          <w:sz w:val="20"/>
-        </w:rPr>
-        <w:t>Type: Multiple choice. Options: In the last week / 2-4 weeks ago / 1-3 months ago / Don't remember.</w:t>
-      </w:r>
-    </w:p>
-    <w:p>
-      <w:r>
-        <w:rPr>
-          <w:b/>
-        </w:rPr>
-        <w:t xml:space="preserve">Q10. </w:t>
-      </w:r>
-      <w:r>
-        <w:rPr>
-          <w:i/>
-          <w:color w:val="1F2A44"/>
-        </w:rPr>
-        <w:t>“Whose appliance is it, technically?”</w:t>
-      </w:r>
-    </w:p>
-    <w:p>
-      <w:r>
-        <w:rPr>
-          <w:i/>
-          <w:color w:val="8A1F2B"/>
-          <w:sz w:val="20"/>
-        </w:rPr>
-        <w:t>Type: Multiple choice, Other free text. Options: Mine or my household's / My landlord's / It belongs to the community/building / Other / Not sure.</w:t>
-      </w:r>
-    </w:p>
-    <w:p>
-      <w:r>
-        <w:rPr>
-          <w:b/>
-        </w:rPr>
-        <w:t xml:space="preserve">Q11. </w:t>
-      </w:r>
-      <w:r>
-        <w:rPr>
-          <w:i/>
-          <w:color w:val="1F2A44"/>
-        </w:rPr>
-        <w:t>“Does your community/building have an official maintenance office or an approved list of people to call, or does everyone arrange repairs on their own?”</w:t>
-      </w:r>
-    </w:p>
-    <w:p>
-      <w:r>
-        <w:rPr>
-          <w:i/>
-          <w:color w:val="8A1F2B"/>
-          <w:sz w:val="20"/>
-        </w:rPr>
-        <w:t>Type: Multiple choice. Options: Yes, there's an official community service/office or approved list we're expected to use / No, everyone arranges it themselves, even if people sometimes recommend technicians informally (like in a WhatsApp group) / A bit of both, depends on the issue / Not sure.</w:t>
-      </w:r>
-    </w:p>
-    <w:p>
-      <w:r>
-        <w:rPr>
-          <w:b/>
-        </w:rPr>
-        <w:t xml:space="preserve">Q12. </w:t>
-      </w:r>
-      <w:r>
-        <w:rPr>
-          <w:i/>
-          <w:color w:val="1F2A44"/>
-        </w:rPr>
-        <w:t>“How did you first get in touch with whoever came to help?”</w:t>
-      </w:r>
-    </w:p>
-    <w:p>
-      <w:r>
-        <w:rPr>
-          <w:i/>
-          <w:color w:val="8A1F2B"/>
-          <w:sz w:val="20"/>
-        </w:rPr>
-        <w:t>Type: Multiple choice, Other free text. Options: Called the brand's service centre / Called a technician I already knew / Used an app (like Urban Company, Housejoy) / Through the building/community's official office or approved list / Someone was recommended in a resident WhatsApp/community group / Asked a shop / Don't remember.</w:t>
-      </w:r>
-    </w:p>
-    <w:p>
-      <w:r>
-        <w:rPr>
-          <w:b/>
-        </w:rPr>
-        <w:t xml:space="preserve">Q13. </w:t>
-      </w:r>
-      <w:r>
-        <w:rPr>
-          <w:i/>
-          <w:color w:val="1F2A44"/>
-        </w:rPr>
-        <w:t>“In your own words — what happened after you first reached out?”</w:t>
-      </w:r>
-    </w:p>
-    <w:p>
-      <w:r>
-        <w:rPr>
-          <w:i/>
-          <w:color w:val="8A1F2B"/>
-          <w:sz w:val="20"/>
-        </w:rPr>
-        <w:t>Type: Paragraph, optional.</w:t>
-      </w:r>
-    </w:p>
-    <w:p>
-      <w:pPr>
-        <w:ind w:left="432"/>
-      </w:pPr>
-      <w:r>
-        <w:rPr>
-          <w:i/>
-          <w:color w:val="555555"/>
-          <w:sz w:val="20"/>
-        </w:rPr>
-        <w:t>Totally optional, write as much or as little as you like.</w:t>
-      </w:r>
-    </w:p>
-    <w:p>
-      <w:pPr>
-        <w:pStyle w:val="Heading2"/>
-      </w:pPr>
-      <w:r>
-        <w:t>SECTION 3 — How much this took from you</w:t>
-      </w:r>
-    </w:p>
-    <w:p>
-      <w:r>
-        <w:rPr>
-          <w:b/>
-        </w:rPr>
-        <w:t xml:space="preserve">Q14. </w:t>
-      </w:r>
-      <w:r>
-        <w:rPr>
-          <w:i/>
-          <w:color w:val="1F2A44"/>
-        </w:rPr>
-        <w:t>“After you first got in touch, how many more times did you have to call or message about this same issue?”</w:t>
-      </w:r>
-    </w:p>
-    <w:p>
-      <w:r>
-        <w:rPr>
-          <w:i/>
-          <w:color w:val="8A1F2B"/>
-          <w:sz w:val="20"/>
-        </w:rPr>
-        <w:t>Type: Multiple choice. Options: None / 1 / 2 / 3-4 / 5-7 / 8 or more / Don't remember.</w:t>
-      </w:r>
-    </w:p>
-    <w:p>
-      <w:r>
-        <w:rPr>
-          <w:b/>
-        </w:rPr>
-        <w:t xml:space="preserve">Q15. </w:t>
-      </w:r>
-      <w:r>
-        <w:rPr>
-          <w:i/>
-          <w:color w:val="1F2A44"/>
-        </w:rPr>
-        <w:t>“Roughly how much of your own time did this take in total — calls, messages, or looking things up (not counting the actual repair time)?”</w:t>
-      </w:r>
-    </w:p>
-    <w:p>
-      <w:r>
-        <w:rPr>
-          <w:i/>
-          <w:color w:val="8A1F2B"/>
-          <w:sz w:val="20"/>
-        </w:rPr>
-        <w:t>Type: Multiple choice. Options: Hardly any (0-5 minutes) / A few minutes (6-15) / About 15-30 minutes / About 30-60 minutes / More than an hour / Don't remember.</w:t>
-      </w:r>
-    </w:p>
-    <w:p>
-      <w:r>
-        <w:rPr>
-          <w:b/>
-        </w:rPr>
-        <w:t xml:space="preserve">Q16. </w:t>
-      </w:r>
-      <w:r>
-        <w:rPr>
-          <w:i/>
-          <w:color w:val="1F2A44"/>
-        </w:rPr>
-        <w:t>“What is the situation now?”</w:t>
-      </w:r>
-    </w:p>
-    <w:p>
-      <w:r>
-        <w:rPr>
-          <w:i/>
-          <w:color w:val="8A1F2B"/>
-          <w:sz w:val="20"/>
-        </w:rPr>
-        <w:t>Type: Multiple choice, Other free text. Options: Fully fixed and working / They said it's done but the problem is still there / Still waiting / We cancelled/gave up / Turned out nothing needed fixing / Other.</w:t>
-      </w:r>
-    </w:p>
-    <w:p>
-      <w:r>
-        <w:rPr>
-          <w:i/>
-          <w:color w:val="8A1F2B"/>
-          <w:sz w:val="20"/>
-        </w:rPr>
-        <w:t>Branching: Fully fixed and working — show Q17. All other answers — skip to Q18.</w:t>
-      </w:r>
-    </w:p>
-    <w:p>
-      <w:r>
-        <w:rPr>
-          <w:b/>
-        </w:rPr>
-        <w:t xml:space="preserve">Q17. </w:t>
-      </w:r>
-      <w:r>
-        <w:t>(only shown if fully fixed — wording depends on the Q8 answer)</w:t>
-      </w:r>
-    </w:p>
-    <w:p>
-      <w:pPr>
-        <w:spacing w:after="160"/>
-        <w:ind w:left="432"/>
-      </w:pPr>
-      <w:r>
-        <w:rPr>
-          <w:i/>
-          <w:color w:val="1F2A44"/>
-          <w:sz w:val="22"/>
-        </w:rPr>
-        <w:t>“If Q8 was a breakdown-type answer: “From when you first noticed something was wrong to when it was actually working again, how long did it take?””</w:t>
-      </w:r>
-    </w:p>
-    <w:p>
-      <w:pPr>
-        <w:spacing w:after="160"/>
-        <w:ind w:left="432"/>
-      </w:pPr>
-      <w:r>
-        <w:rPr>
-          <w:i/>
-          <w:color w:val="1F2A44"/>
-          <w:sz w:val="22"/>
-        </w:rPr>
-        <w:t>“If Q8 was a routine/scheduled-type answer: “From when you decided to get this done to when it was actually completed, how long did it take?””</w:t>
-      </w:r>
-    </w:p>
-    <w:p>
-      <w:r>
-        <w:rPr>
-          <w:i/>
-          <w:color w:val="8A1F2B"/>
-          <w:sz w:val="20"/>
-        </w:rPr>
-        <w:t>Type: Multiple choice (same options either way). Options: Same day / 1-2 days / 3-7 days / 8-14 days / 15 days or more / Don't remember.</w:t>
-      </w:r>
-    </w:p>
-    <w:p>
-      <w:pPr>
-        <w:ind w:left="432"/>
-      </w:pPr>
-      <w:r>
-        <w:rPr>
-          <w:i/>
-          <w:color w:val="555555"/>
-          <w:sz w:val="20"/>
-        </w:rPr>
-        <w:t>Build this as two question objects in Forms, shown via section branching depending on the Q8 answer — Forms cannot swap question text conditionally within one object.</w:t>
-      </w:r>
-    </w:p>
-    <w:p>
-      <w:r>
-        <w:rPr>
-          <w:b/>
-        </w:rPr>
-        <w:t xml:space="preserve">Q18. </w:t>
-      </w:r>
-      <w:r>
-        <w:rPr>
-          <w:i/>
-          <w:color w:val="1F2A44"/>
-        </w:rPr>
-        <w:t>“Overall, how much hassle did this take for you?”</w:t>
-      </w:r>
-    </w:p>
-    <w:p>
-      <w:r>
-        <w:rPr>
-          <w:i/>
-          <w:color w:val="8A1F2B"/>
-          <w:sz w:val="20"/>
-        </w:rPr>
-        <w:t>Type: Multiple choice. Options: Very little / A little / A moderate amount / A lot / A huge amount / Would rather not say.</w:t>
-      </w:r>
-    </w:p>
-    <w:p>
-      <w:r>
-        <w:rPr>
-          <w:b/>
-        </w:rPr>
-        <w:t xml:space="preserve">Q19. </w:t>
-      </w:r>
-      <w:r>
-        <w:rPr>
-          <w:i/>
-          <w:color w:val="1F2A44"/>
-        </w:rPr>
-        <w:t>“Looking back, what was the most difficult or annoying part of the whole thing, if anything?”</w:t>
-      </w:r>
-    </w:p>
-    <w:p>
-      <w:r>
-        <w:rPr>
-          <w:i/>
-          <w:color w:val="8A1F2B"/>
-          <w:sz w:val="20"/>
-        </w:rPr>
-        <w:t>Type: Paragraph, optional.</w:t>
-      </w:r>
-    </w:p>
-    <w:p>
-      <w:pPr>
-        <w:ind w:left="432"/>
-      </w:pPr>
-      <w:r>
-        <w:rPr>
-          <w:i/>
-          <w:color w:val="555555"/>
-          <w:sz w:val="20"/>
-        </w:rPr>
-        <w:t>If honestly nothing was difficult, that's a completely fine answer too.</w:t>
-      </w:r>
-    </w:p>
-    <w:p>
-      <w:pPr>
-        <w:pStyle w:val="Heading2"/>
-      </w:pPr>
-      <w:r>
-        <w:t>SECTION 4 — Who decided, and who paid</w:t>
-      </w:r>
-    </w:p>
-    <w:p>
-      <w:r>
-        <w:rPr>
-          <w:b/>
-        </w:rPr>
-        <w:t xml:space="preserve">Q20. </w:t>
-      </w:r>
-      <w:r>
-        <w:rPr>
-          <w:i/>
-          <w:color w:val="1F2A44"/>
-        </w:rPr>
-        <w:t>“Who decided to go ahead and get it fixed — that is, who made the call to contact someone or let the work start?”</w:t>
-      </w:r>
-    </w:p>
-    <w:p>
-      <w:r>
-        <w:rPr>
-          <w:i/>
-          <w:color w:val="8A1F2B"/>
-          <w:sz w:val="20"/>
-        </w:rPr>
-        <w:t>Type: Multiple choice, Other free text. Options: Me / Another person in my household / My landlord / The building/community office / We decided together / No real decision was needed / Not sure.</w:t>
-      </w:r>
-    </w:p>
-    <w:p>
-      <w:pPr>
-        <w:ind w:left="432"/>
-      </w:pPr>
-      <w:r>
-        <w:rPr>
-          <w:i/>
-          <w:color w:val="555555"/>
-          <w:sz w:val="20"/>
-        </w:rPr>
-        <w:t>This counts even if it felt like a small, easy decision.</w:t>
-      </w:r>
-    </w:p>
-    <w:p>
-      <w:r>
-        <w:rPr>
-          <w:b/>
-        </w:rPr>
-        <w:t xml:space="preserve">Q21. </w:t>
-      </w:r>
-      <w:r>
-        <w:rPr>
-          <w:i/>
-          <w:color w:val="1F2A44"/>
-        </w:rPr>
-        <w:t>“If the cost came up at all, who had the final say on whether the price was okay?”</w:t>
-      </w:r>
-    </w:p>
-    <w:p>
-      <w:r>
-        <w:rPr>
-          <w:i/>
-          <w:color w:val="8A1F2B"/>
-          <w:sz w:val="20"/>
-        </w:rPr>
-        <w:t>Type: Multiple choice, Other free text. Options: Me / Another person in my household / My landlord / The building/community office / No cost discussion happened / Not sure.</w:t>
-      </w:r>
-    </w:p>
-    <w:p>
-      <w:r>
-        <w:rPr>
-          <w:b/>
-        </w:rPr>
-        <w:t xml:space="preserve">Q22. </w:t>
-      </w:r>
-      <w:r>
-        <w:rPr>
-          <w:i/>
-          <w:color w:val="1F2A44"/>
-        </w:rPr>
-        <w:t>“Who actually paid for it?”</w:t>
-      </w:r>
-    </w:p>
-    <w:p>
-      <w:r>
-        <w:rPr>
-          <w:i/>
-          <w:color w:val="8A1F2B"/>
-          <w:sz w:val="20"/>
-        </w:rPr>
-        <w:t>Type: Multiple choice, Other free text. Options: Me / Another person in my household / My landlord / The building/community office / Not paid yet / Nothing to pay / Not sure.</w:t>
-      </w:r>
-    </w:p>
-    <w:p>
-      <w:r>
-        <w:rPr>
-          <w:b/>
-        </w:rPr>
-        <w:t xml:space="preserve">Q23. </w:t>
-      </w:r>
-      <w:r>
-        <w:rPr>
-          <w:i/>
-          <w:color w:val="1F2A44"/>
-        </w:rPr>
-        <w:t>“Did the price change after it was first agreed?”</w:t>
-      </w:r>
-    </w:p>
-    <w:p>
-      <w:r>
-        <w:rPr>
-          <w:i/>
-          <w:color w:val="8A1F2B"/>
-          <w:sz w:val="20"/>
-        </w:rPr>
-        <w:t>Type: Multiple choice. Options: Yes / No / No price was agreed in advance / Don't remember.</w:t>
-      </w:r>
-    </w:p>
-    <w:p>
-      <w:r>
-        <w:rPr>
-          <w:i/>
-          <w:color w:val="8A1F2B"/>
-          <w:sz w:val="20"/>
-        </w:rPr>
-        <w:t>Branching: Yes — show Q23a.</w:t>
-      </w:r>
-    </w:p>
-    <w:p>
-      <w:r>
-        <w:rPr>
-          <w:b/>
-        </w:rPr>
-        <w:t xml:space="preserve">Q23a. </w:t>
-      </w:r>
-      <w:r>
-        <w:rPr>
-          <w:i/>
-          <w:color w:val="1F2A44"/>
-        </w:rPr>
-        <w:t>“(only if price changed) What happened then?”</w:t>
-      </w:r>
-    </w:p>
-    <w:p>
-      <w:r>
-        <w:rPr>
-          <w:i/>
-          <w:color w:val="8A1F2B"/>
-          <w:sz w:val="20"/>
-        </w:rPr>
-        <w:t>Type: Paragraph.</w:t>
-      </w:r>
-    </w:p>
-    <w:p>
-      <w:r>
-        <w:rPr>
-          <w:b/>
-        </w:rPr>
-        <w:t xml:space="preserve">Q24. </w:t>
-      </w:r>
-      <w:r>
-        <w:rPr>
-          <w:i/>
-          <w:color w:val="1F2A44"/>
-        </w:rPr>
-        <w:t>“Did any part, or the whole appliance, have to be picked up, sent somewhere, or delivered from somewhere else?”</w:t>
-      </w:r>
-    </w:p>
-    <w:p>
-      <w:r>
-        <w:rPr>
-          <w:i/>
-          <w:color w:val="8A1F2B"/>
-          <w:sz w:val="20"/>
-        </w:rPr>
-        <w:t>Type: Multiple choice. Options: Yes / No / Not sure.</w:t>
-      </w:r>
-    </w:p>
-    <w:p>
-      <w:r>
-        <w:rPr>
-          <w:i/>
-          <w:color w:val="8A1F2B"/>
-          <w:sz w:val="20"/>
-        </w:rPr>
-        <w:t>Branching: Yes — show Q24a.</w:t>
-      </w:r>
-    </w:p>
-    <w:p>
-      <w:r>
-        <w:rPr>
-          <w:b/>
-        </w:rPr>
-        <w:t xml:space="preserve">Q24a. </w:t>
-      </w:r>
-      <w:r>
-        <w:rPr>
-          <w:i/>
-          <w:color w:val="1F2A44"/>
-        </w:rPr>
-        <w:t>“(only if yes) Who arranged that?”</w:t>
-      </w:r>
-    </w:p>
-    <w:p>
-      <w:r>
-        <w:rPr>
-          <w:i/>
-          <w:color w:val="8A1F2B"/>
-          <w:sz w:val="20"/>
-        </w:rPr>
-        <w:t>Type: Multiple choice, Other free text. Options: I did / The technician/company did / Someone else / Not sure.</w:t>
-      </w:r>
-    </w:p>
-    <w:p>
-      <w:pPr>
-        <w:pStyle w:val="Heading2"/>
-      </w:pPr>
-      <w:r>
-        <w:t>SECTION 5 — Remembering and keeping track</w:t>
-      </w:r>
-    </w:p>
-    <w:p>
-      <w:r>
-        <w:rPr>
-          <w:b/>
-        </w:rPr>
-        <w:t xml:space="preserve">Q25. </w:t>
-      </w:r>
-      <w:r>
-        <w:rPr>
-          <w:i/>
-          <w:color w:val="1F2A44"/>
-        </w:rPr>
-        <w:t>“Do you keep track of servicing dates or technician numbers in any way — like a saved phone contact, a note, a notebook, a sticker on the appliance, or a WhatsApp chat?”</w:t>
-      </w:r>
-    </w:p>
-    <w:p>
-      <w:r>
-        <w:rPr>
-          <w:i/>
-          <w:color w:val="8A1F2B"/>
-          <w:sz w:val="20"/>
-        </w:rPr>
-        <w:t>Type: Multiple choice. Options: Yes — a saved contact/number in my phone / Yes — a note, list, or notebook / Yes — something else / No, I don't keep track of it / I just remember it in my head.</w:t>
-      </w:r>
-    </w:p>
-    <w:p>
-      <w:r>
-        <w:rPr>
-          <w:i/>
-          <w:color w:val="8A1F2B"/>
-          <w:sz w:val="20"/>
-        </w:rPr>
-        <w:t>Branching: Any Yes — show Q25a.</w:t>
-      </w:r>
-    </w:p>
-    <w:p>
-      <w:r>
-        <w:rPr>
-          <w:b/>
-        </w:rPr>
-        <w:t xml:space="preserve">Q25a. </w:t>
-      </w:r>
-      <w:r>
-        <w:rPr>
-          <w:i/>
-          <w:color w:val="1F2A44"/>
-        </w:rPr>
-        <w:t>“(only if any Yes above, and it isn't just a phone contact) Could you briefly describe it — what it is, and how you made it?”</w:t>
-      </w:r>
-    </w:p>
-    <w:p>
-      <w:r>
-        <w:rPr>
-          <w:i/>
-          <w:color w:val="8A1F2B"/>
-          <w:sz w:val="20"/>
-        </w:rPr>
-        <w:t>Type: Paragraph, optional.</w:t>
-      </w:r>
-    </w:p>
-    <w:p>
-      <w:r>
-        <w:rPr>
-          <w:b/>
-        </w:rPr>
-        <w:t xml:space="preserve">Q26. </w:t>
-      </w:r>
-      <w:r>
-        <w:rPr>
-          <w:i/>
-          <w:color w:val="1F2A44"/>
-        </w:rPr>
-        <w:t>“Is this specific appliance under a paid yearly service contract (sometimes called an “AMC,” or annual maintenance contract), or do you just call someone you know when something breaks?”</w:t>
-      </w:r>
-    </w:p>
-    <w:p>
-      <w:r>
-        <w:rPr>
-          <w:i/>
-          <w:color w:val="8A1F2B"/>
-          <w:sz w:val="20"/>
-        </w:rPr>
-        <w:t>Type: Multiple choice. Options: Yes, I pay a yearly fee for regular servicing / No, I just call someone I know when needed / No fixed arrangement either way / Not sure.</w:t>
-      </w:r>
-    </w:p>
-    <w:p>
-      <w:r>
-        <w:rPr>
-          <w:b/>
-        </w:rPr>
-        <w:t xml:space="preserve">Q27. </w:t>
-      </w:r>
-      <w:r>
-        <w:rPr>
-          <w:i/>
-          <w:color w:val="1F2A44"/>
-        </w:rPr>
-        <w:t>“Do you get automatic reminders for anything else at home — like renewing vehicle insurance, your vehicle's pollution certificate (PUC), or booking your cooking gas cylinder? How is that different from how (or whether) you get reminded about appliance servicing?”</w:t>
-      </w:r>
-    </w:p>
-    <w:p>
-      <w:r>
-        <w:rPr>
-          <w:i/>
-          <w:color w:val="8A1F2B"/>
-          <w:sz w:val="20"/>
-        </w:rPr>
-        <w:t>Type: Paragraph, optional.</w:t>
-      </w:r>
-    </w:p>
-    <w:p>
-      <w:pPr>
-        <w:pStyle w:val="Heading2"/>
-      </w:pPr>
-      <w:r>
-        <w:t>SECTION 6 — A few more in your own words</w:t>
-      </w:r>
-    </w:p>
-    <w:p>
-      <w:pPr>
-        <w:ind w:left="432"/>
-      </w:pPr>
-      <w:r>
-        <w:rPr>
-          <w:i/>
-          <w:color w:val="555555"/>
-          <w:sz w:val="20"/>
-        </w:rPr>
-        <w:t>Intro text shown to the respondent: Just a few optional questions left where we'd love to hear it in your own words. Skip anything you don't feel like answering.</w:t>
-      </w:r>
-    </w:p>
-    <w:p>
-      <w:r>
-        <w:rPr>
-          <w:b/>
-        </w:rPr>
-        <w:t xml:space="preserve">Q28. </w:t>
-      </w:r>
-      <w:r>
-        <w:rPr>
-          <w:i/>
-          <w:color w:val="1F2A44"/>
-        </w:rPr>
-        <w:t>“Has there ever been a small repair at home that you just never got around to calling anyone about — you either lived with it, fixed it yourself, or asked a friend/family member instead? Tell us briefly what happened.”</w:t>
-      </w:r>
-    </w:p>
-    <w:p>
-      <w:r>
-        <w:rPr>
-          <w:i/>
-          <w:color w:val="8A1F2B"/>
-          <w:sz w:val="20"/>
-        </w:rPr>
-        <w:t>Type: Paragraph, optional.</w:t>
-      </w:r>
-    </w:p>
-    <w:p>
-      <w:r>
-        <w:rPr>
-          <w:b/>
-        </w:rPr>
-        <w:t xml:space="preserve">Q29. </w:t>
-      </w:r>
-      <w:r>
-        <w:rPr>
-          <w:i/>
-          <w:color w:val="1F2A44"/>
-        </w:rPr>
-        <w:t>“If someone you fully trusted could handle all of this for you next time, which part would you happily hand over to them, and which part would you always want to decide yourself?”</w:t>
-      </w:r>
-    </w:p>
-    <w:p>
-      <w:r>
-        <w:rPr>
-          <w:i/>
-          <w:color w:val="8A1F2B"/>
-          <w:sz w:val="20"/>
-        </w:rPr>
-        <w:t>Type: Paragraph, optional.</w:t>
-      </w:r>
-    </w:p>
-    <w:p>
-      <w:r>
-        <w:rPr>
-          <w:b/>
-        </w:rPr>
-        <w:t xml:space="preserve">Q30. </w:t>
-      </w:r>
-      <w:r>
-        <w:rPr>
-          <w:i/>
-          <w:color w:val="1F2A44"/>
-        </w:rPr>
-        <w:t>“Is there anything about this whole experience we haven't asked about, but you think we should know?”</w:t>
-      </w:r>
-    </w:p>
-    <w:p>
-      <w:r>
-        <w:rPr>
-          <w:i/>
-          <w:color w:val="8A1F2B"/>
-          <w:sz w:val="20"/>
-        </w:rPr>
-        <w:t>Type: Paragraph, optional.</w:t>
-      </w:r>
-    </w:p>
-    <w:p>
-      <w:pPr>
-        <w:pStyle w:val="Heading2"/>
-      </w:pPr>
-      <w:r>
-        <w:t>SECTION 7 — About you (shown to everyone, including those screened out at Q6)</w:t>
-      </w:r>
-    </w:p>
-    <w:p>
-      <w:r>
-        <w:rPr>
-          <w:b/>
-        </w:rPr>
-        <w:t xml:space="preserve">Q31. </w:t>
-      </w:r>
-      <w:r>
-        <w:rPr>
-          <w:i/>
-          <w:color w:val="1F2A44"/>
-        </w:rPr>
-        <w:t>“What is your age group?”</w:t>
-      </w:r>
-    </w:p>
-    <w:p>
-      <w:r>
-        <w:rPr>
-          <w:i/>
-          <w:color w:val="8A1F2B"/>
-          <w:sz w:val="20"/>
-        </w:rPr>
-        <w:t>Type: Multiple choice. Options: 18-24 / 25-34 / 35-44 / 45-54 / 55-64 / 65 or older / Would rather not say.</w:t>
-      </w:r>
-    </w:p>
-    <w:p>
-      <w:r>
-        <w:rPr>
-          <w:b/>
-        </w:rPr>
-        <w:t xml:space="preserve">Q32. </w:t>
-      </w:r>
-      <w:r>
-        <w:rPr>
-          <w:i/>
-          <w:color w:val="1F2A44"/>
-        </w:rPr>
-        <w:t>“Which of these best describes you?”</w:t>
-      </w:r>
-    </w:p>
-    <w:p>
-      <w:r>
-        <w:rPr>
-          <w:i/>
-          <w:color w:val="8A1F2B"/>
-          <w:sz w:val="20"/>
-        </w:rPr>
-        <w:t>Type: Multiple choice. Options: Woman / Man / Prefer to self-describe / Would rather not say.</w:t>
-      </w:r>
-    </w:p>
-    <w:p>
-      <w:r>
-        <w:rPr>
-          <w:b/>
-        </w:rPr>
-        <w:t xml:space="preserve">Q33. </w:t>
-      </w:r>
-      <w:r>
-        <w:rPr>
-          <w:i/>
-          <w:color w:val="1F2A44"/>
-        </w:rPr>
-        <w:t>“Which of these best describes your home?”</w:t>
-      </w:r>
-    </w:p>
-    <w:p>
-      <w:r>
-        <w:rPr>
-          <w:i/>
-          <w:color w:val="8A1F2B"/>
-          <w:sz w:val="20"/>
-        </w:rPr>
-        <w:t>Type: Multiple choice, Other free text. Options: Own home / Rented / Staying with family / PG or shared accommodation / Other / Would rather not say.</w:t>
-      </w:r>
-    </w:p>
-    <w:p>
-      <w:pPr>
-        <w:pStyle w:val="Heading2"/>
-      </w:pPr>
-      <w:r>
-        <w:t>Closing screen</w:t>
-      </w:r>
-    </w:p>
-    <w:p>
-      <w:pPr>
-        <w:spacing w:after="160"/>
-        <w:ind w:left="432"/>
-      </w:pPr>
-      <w:r>
-        <w:rPr>
-          <w:i/>
-          <w:color w:val="1F2A44"/>
-          <w:sz w:val="22"/>
-        </w:rPr>
-        <w:t>“Thank you so much for your time! If you'd be open to a short 20-30 minute conversation about your experience (completely optional, separate from this form), you can leave your contact here: [separate optional link] — nobody will contact you unless you fill this in yourself.”</w:t>
-      </w:r>
-    </w:p>
-    <w:p>
-      <w:pPr>
-        <w:pStyle w:val="Heading2"/>
-      </w:pPr>
-      <w:r>
-        <w:t>Google Forms build notes</w:t>
-      </w:r>
-    </w:p>
-    <w:p>
-      <w:pPr>
-        <w:pStyle w:val="ListBullet"/>
-      </w:pPr>
-      <w:r>
-        <w:t>Use “Sections” (the Forms feature) for every branch point, not just headings: Q1 and Q2 to end, Q6 to Section 7, Q16 to Q17's skip, Q23 to Q23a, Q24 to Q24a, Q25 to Q25a.</w:t>
-      </w:r>
-    </w:p>
-    <w:p>
-      <w:pPr>
-        <w:pStyle w:val="ListBullet"/>
-      </w:pPr>
-      <w:r>
-        <w:t>Turn OFF “Shuffle question order” — the ordering is deliberate (unprimed open questions before structured ones, general before specific), per the anti-priming principle both the team's own prior survey audit and Pew Research's question-order guidance rely on.</w:t>
-      </w:r>
-    </w:p>
-    <w:p>
-      <w:pPr>
-        <w:pStyle w:val="ListBullet"/>
-      </w:pPr>
-      <w:r>
-        <w:t>Do NOT turn on “Limit to 1 response” (which requires Google sign-in) — see Part 2 for why, and what to do instead.</w:t>
-      </w:r>
-    </w:p>
-    <w:p>
-      <w:pPr>
-        <w:pStyle w:val="ListBullet"/>
-      </w:pPr>
-      <w:r>
-        <w:t>Q17 needs two separate question objects (one per wording), each shown only for the relevant Q8 answers via section branching — Forms cannot conditionally swap question text within one question object.</w:t>
-      </w:r>
-    </w:p>
-    <w:p>
-      <w:r>
-        <w:br w:type="page"/>
-      </w:r>
-    </w:p>
-    <w:p>
-      <w:pPr>
-        <w:pStyle w:val="Heading1"/>
-      </w:pPr>
-      <w:r>
-        <w:t>Part 5 — How we tested it: two cognitive pilots, and what changed</w:t>
-      </w:r>
-    </w:p>
-    <w:p>
-      <w:r>
-        <w:t>Before finalizing, the draft was pretested using the same “cognitive pretesting” method the team's own research plan already prescribes for its in-person pilots: read each question the way a real respondent would, answer it in character, and ask what the question meant to you, how you worked out your answer, and whether an option was missing. Two AI-simulated respondents ran this test — a less digitally-fluent Hyderabad homemaker, and a more app-comfortable Visakhapatnam homemaker whose most recent real incident was genuinely ambiguous between two candidate machines in the same week. Full personas in the Appendix.</w:t>
+        <w:t>This is the actual test each surviving question had to pass. The three rails are Voice, Payments &amp; Authorisation (one combined rail, matching the competition's own partner structure), and Logistics — and the competition's own 10 answers (Q1 team/access, Q2 the insight, Q3 the six-step loop, Q4 rail roles, Q5 the rail to innovate on, Q6 the customer asset, Q7 the adjacent use case, Q8 the personal boundary, Q9 the incumbent counterfactual, Q10 the track) are the other thing every question here was checked against, per this project's own narrowing strategy (narrowed_problem.md, research_plan.md).</w:t>
       </w:r>
     </w:p>
     <w:tbl>
@@ -1758,7 +248,7 @@
               <w:rPr>
                 <w:b/>
               </w:rPr>
-              <w:t>Found in pilot</w:t>
+              <w:t>Question</w:t>
             </w:r>
           </w:p>
         </w:tc>
@@ -1771,7 +261,7 @@
               <w:rPr>
                 <w:b/>
               </w:rPr>
-              <w:t>The risk</w:t>
+              <w:t>What it's really testing</w:t>
             </w:r>
           </w:p>
         </w:tc>
@@ -1784,7 +274,7 @@
               <w:rPr>
                 <w:b/>
               </w:rPr>
-              <w:t>The fix, now in Part 4</w:t>
+              <w:t>Feeds</w:t>
             </w:r>
           </w:p>
         </w:tc>
@@ -1796,7 +286,7 @@
           </w:tcPr>
           <w:p>
             <w:r>
-              <w:t>Vizag pilot: the “most recent time” instruction had no tie-breaking rule when a respondent had two candidate incidents in the same week (a routine filter change and an AC gas top-up).</w:t>
+              <w:t>Q1 (screener)</w:t>
             </w:r>
           </w:p>
         </w:tc>
@@ -1806,7 +296,7 @@
           </w:tcPr>
           <w:p>
             <w:r>
-              <w:t>Different respondents in the same situation would resolve the ambiguity inconsistently, likely gravitating toward whichever incident felt more “eventful” — quietly biasing the whole dataset toward breakdowns over routine servicing, invisibly to anyone just looking at the resulting spreadsheet.</w:t>
+              <w:t>Eligibility — a genuine recent incident, not a hypothetical</w:t>
             </w:r>
           </w:p>
         </w:tc>
@@ -1816,7 +306,7 @@
           </w:tcPr>
           <w:p>
             <w:r>
-              <w:t>Added an explicit tie-breaker (“pick whichever happened last, even by a day or two”) and broadened the opening framing to explicitly include routine maintenance.</w:t>
+              <w:t>Sample quality</w:t>
             </w:r>
           </w:p>
         </w:tc>
@@ -1828,7 +318,7 @@
           </w:tcPr>
           <w:p>
             <w:r>
-              <w:t>Vizag pilot: no answer option existed for “wasn't working as well as before” or “routine top-up, nothing broken”.</w:t>
+              <w:t>Q2 (which appliance)</w:t>
             </w:r>
           </w:p>
         </w:tc>
@@ -1838,7 +328,7 @@
           </w:tcPr>
           <w:p>
             <w:r>
-              <w:t>A real, common situation (a filter change, a gas top-up) had nowhere to go except a misleading “regular yearly service” or a vague “Other,” losing exactly the routine-vs-breakdown distinction the study cares about.</w:t>
+              <w:t>Which object/segment is actually recurring across many households, not just the interview sample</w:t>
             </w:r>
           </w:p>
         </w:tc>
@@ -1848,7 +338,7 @@
           </w:tcPr>
           <w:p>
             <w:r>
-              <w:t>Added both options directly to the question about what the situation was.</w:t>
+              <w:t>Filter 1 (object/domain), Q2 insight scope</w:t>
             </w:r>
           </w:p>
         </w:tc>
@@ -1860,7 +350,7 @@
           </w:tcPr>
           <w:p>
             <w:r>
-              <w:t>Vizag pilot: the completion-time question assumed a breakdown (“first noticed the problem”) for every respondent, including someone whose incident was a scheduled, nothing-broken filter change.</w:t>
+              <w:t>Q3 (situation type)</w:t>
             </w:r>
           </w:p>
         </w:tc>
@@ -1870,7 +360,7 @@
           </w:tcPr>
           <w:p>
             <w:r>
-              <w:t>Respondents with a routine incident would have to awkwardly reinterpret “noticing a problem” for an event where nothing was ever wrong, producing inconsistent, hard-to-interpret timing data.</w:t>
+              <w:t>Breakdown vs. routine/preventive servicing — whether the pain is mostly reactive or mostly forgotten-until-due</w:t>
             </w:r>
           </w:p>
         </w:tc>
@@ -1880,7 +370,7 @@
           </w:tcPr>
           <w:p>
             <w:r>
-              <w:t>The question now branches its own wording based on the earlier answer about what the situation was, instead of forcing breakdown language onto every case.</w:t>
+              <w:t>Q2 insight, Q3 trigger step</w:t>
             </w:r>
           </w:p>
         </w:tc>
@@ -1892,7 +382,7 @@
           </w:tcPr>
           <w:p>
             <w:r>
-              <w:t>Hyderabad pilot: “PUC” was used with no explanation at all.</w:t>
+              <w:t>Q4 (first contact channel)</w:t>
             </w:r>
           </w:p>
         </w:tc>
@@ -1902,7 +392,7 @@
           </w:tcPr>
           <w:p>
             <w:r>
-              <w:t>A respondent who doesn't personally handle the family vehicle's paperwork — a realistic case for many housewife respondents — would not know the term, and either skip the question or feel a small, needless dent in confidence about the whole survey.</w:t>
+              <w:t>Which existing solution (brand, app, technician, community) actually gets used first, and how often each one does</w:t>
             </w:r>
           </w:p>
         </w:tc>
@@ -1912,7 +402,7 @@
           </w:tcPr>
           <w:p>
             <w:r>
-              <w:t>Spelled out in full (“your vehicle's pollution certificate (PUC)”) so the acronym is never load-bearing.</w:t>
+              <w:t>Q9 incumbent counterfactual</w:t>
             </w:r>
           </w:p>
         </w:tc>
@@ -1924,7 +414,7 @@
           </w:tcPr>
           <w:p>
             <w:r>
-              <w:t>Hyderabad pilot: the record-keeping question's options didn't include the single most common real answer — a technician's number saved as a plain phone contact.</w:t>
+              <w:t>Q5 (managed vs. independent)</w:t>
             </w:r>
           </w:p>
         </w:tc>
@@ -1934,7 +424,7 @@
           </w:tcPr>
           <w:p>
             <w:r>
-              <w:t>A respondent with exactly this (very common) habit had no honest option to pick, and would likely under-report by choosing “No, I don't” or “I just remember it in my head,” losing real evidence of an already-existing personal system.</w:t>
+              <w:t>The team's own core segmentation axis — does a shared building system exist, or is every household on its own</w:t>
             </w:r>
           </w:p>
         </w:tc>
@@ -1944,7 +434,7 @@
           </w:tcPr>
           <w:p>
             <w:r>
-              <w:t>Added “a saved contact/number in my phone” as its own explicit, first-listed option.</w:t>
+              <w:t>Filter 2 (segment), the managed-vs-independent hypothesis</w:t>
             </w:r>
           </w:p>
         </w:tc>
@@ -1956,7 +446,7 @@
           </w:tcPr>
           <w:p>
             <w:r>
-              <w:t>Hyderabad pilot: one question silently asked two different things at once — who decided to go ahead with the repair, and who approved the final price — as if they were the same decision.</w:t>
+              <w:t>Q6 (grid: decide/approve/pay/access)</w:t>
             </w:r>
           </w:p>
         </w:tc>
@@ -1966,7 +456,7 @@
           </w:tcPr>
           <w:p>
             <w:r>
-              <w:t>In a real, common pattern (someone decides to proceed themselves, then separately checks with a spouse just on whether the price sounds fair), only one merged answer was possible, so respondents would default to a hedge like “we decided together” that hides the more precise, more useful story.</w:t>
+              <w:t>Whether one person holds all four roles or they're split across people — the single most direct test of whether delegated spending authority is a real, needed mechanism</w:t>
             </w:r>
           </w:p>
         </w:tc>
@@ -1976,7 +466,7 @@
           </w:tcPr>
           <w:p>
             <w:r>
-              <w:t>Split into two separate questions — who decided to proceed, and separately, who had final say on the price.</w:t>
+              <w:t>Payments &amp; Authorisation rail (Q4/Q5), Q6 customer asset reasoning</w:t>
             </w:r>
           </w:p>
         </w:tc>
@@ -1988,7 +478,7 @@
           </w:tcPr>
           <w:p>
             <w:r>
-              <w:t>Both pilots, different angles: an official community maintenance office and an informal WhatsApp-group technician recommendation were bundled into one answer option in two different questions.</w:t>
+              <w:t>Q7 (promise kept)</w:t>
             </w:r>
           </w:p>
         </w:tc>
@@ -1998,7 +488,7 @@
           </w:tcPr>
           <w:p>
             <w:r>
-              <w:t>These are structurally different arrangements — one is an institutional system, the other is social word-of-mouth — and merging them loses exactly the managed-vs-independent distinction this whole research project is built around.</w:t>
+              <w:t>Whether commitments made over a call are reliable, or routinely broken with no checkpoint</w:t>
             </w:r>
           </w:p>
         </w:tc>
@@ -2008,7 +498,7 @@
           </w:tcPr>
           <w:p>
             <w:r>
-              <w:t>Split into separate, explicit options in both questions.</w:t>
+              <w:t>Voice rail (Q4/Q5), the "no reliable checkpoint" hypothesis</w:t>
             </w:r>
           </w:p>
         </w:tc>
@@ -2020,7 +510,7 @@
           </w:tcPr>
           <w:p>
             <w:r>
-              <w:t>Both pilots flagged the closing demographic question as a near-exact repeat of an earlier screening question, using a different, incompatible answer scale.</w:t>
+              <w:t>Q8 (follow-up count)</w:t>
             </w:r>
           </w:p>
         </w:tc>
@@ -2030,7 +520,7 @@
           </w:tcPr>
           <w:p>
             <w:r>
-              <w:t>An attentive respondent notices the repetition (mild irritation at the end of the form), and the two answers don't map cleanly onto each other for analysis, since they use different response options.</w:t>
+              <w:t>How much repeated coordination work a household absorbs per incident</w:t>
             </w:r>
           </w:p>
         </w:tc>
@@ -2040,7 +530,199 @@
           </w:tcPr>
           <w:p>
             <w:r>
-              <w:t>Removed the duplicate question entirely — the earlier question already captures this.</w:t>
+              <w:t>Voice rail reliability, R1 (where human work accumulates)</w:t>
+            </w:r>
+          </w:p>
+        </w:tc>
+      </w:tr>
+      <w:tr>
+        <w:tc>
+          <w:tcPr>
+            <w:tcW w:type="dxa" w:w="2880"/>
+          </w:tcPr>
+          <w:p>
+            <w:r>
+              <w:t>Q9 (did anything travel)</w:t>
+            </w:r>
+          </w:p>
+        </w:tc>
+        <w:tc>
+          <w:tcPr>
+            <w:tcW w:type="dxa" w:w="2880"/>
+          </w:tcPr>
+          <w:p>
+            <w:r>
+              <w:t>Whether physical movement of a part or the appliance is ever really part of this job</w:t>
+            </w:r>
+          </w:p>
+        </w:tc>
+        <w:tc>
+          <w:tcPr>
+            <w:tcW w:type="dxa" w:w="2880"/>
+          </w:tcPr>
+          <w:p>
+            <w:r>
+              <w:t>Logistics rail (Q4/Q5) — a rail can be honestly absent, but only if checked, not assumed</w:t>
+            </w:r>
+          </w:p>
+        </w:tc>
+      </w:tr>
+      <w:tr>
+        <w:tc>
+          <w:tcPr>
+            <w:tcW w:type="dxa" w:w="2880"/>
+          </w:tcPr>
+          <w:p>
+            <w:r>
+              <w:t>Q10 (how they track servicing info)</w:t>
+            </w:r>
+          </w:p>
+        </w:tc>
+        <w:tc>
+          <w:tcPr>
+            <w:tcW w:type="dxa" w:w="2880"/>
+          </w:tcPr>
+          <w:p>
+            <w:r>
+              <w:t>What record-keeping already exists by hand, and whether it's worth building on</w:t>
+            </w:r>
+          </w:p>
+        </w:tc>
+        <w:tc>
+          <w:tcPr>
+            <w:tcW w:type="dxa" w:w="2880"/>
+          </w:tcPr>
+          <w:p>
+            <w:r>
+              <w:t>Q6 customer asset, R4 (what context is missing)</w:t>
+            </w:r>
+          </w:p>
+        </w:tc>
+      </w:tr>
+      <w:tr>
+        <w:tc>
+          <w:tcPr>
+            <w:tcW w:type="dxa" w:w="2880"/>
+          </w:tcPr>
+          <w:p>
+            <w:r>
+              <w:t>Q11 (overall hassle)</w:t>
+            </w:r>
+          </w:p>
+        </w:tc>
+        <w:tc>
+          <w:tcPr>
+            <w:tcW w:type="dxa" w:w="2880"/>
+          </w:tcPr>
+          <w:p>
+            <w:r>
+              <w:t>A single, simple experience measure to sit alongside the more detailed interview data</w:t>
+            </w:r>
+          </w:p>
+        </w:tc>
+        <w:tc>
+          <w:tcPr>
+            <w:tcW w:type="dxa" w:w="2880"/>
+          </w:tcPr>
+          <w:p>
+            <w:r>
+              <w:t>Corroboration for Q2's insight, cross-tab by segment</w:t>
+            </w:r>
+          </w:p>
+        </w:tc>
+      </w:tr>
+      <w:tr>
+        <w:tc>
+          <w:tcPr>
+            <w:tcW w:type="dxa" w:w="2880"/>
+          </w:tcPr>
+          <w:p>
+            <w:r>
+              <w:t>Q12 (never-reported small issue)</w:t>
+            </w:r>
+          </w:p>
+        </w:tc>
+        <w:tc>
+          <w:tcPr>
+            <w:tcW w:type="dxa" w:w="2880"/>
+          </w:tcPr>
+          <w:p>
+            <w:r>
+              <w:t>The single highest-value open question — a real workaround or unresolved issue nobody had to prompt</w:t>
+            </w:r>
+          </w:p>
+        </w:tc>
+        <w:tc>
+          <w:tcPr>
+            <w:tcW w:type="dxa" w:w="2880"/>
+          </w:tcPr>
+          <w:p>
+            <w:r>
+              <w:t>Q2's "what you weren't looking for" evidence criterion</w:t>
+            </w:r>
+          </w:p>
+        </w:tc>
+      </w:tr>
+      <w:tr>
+        <w:tc>
+          <w:tcPr>
+            <w:tcW w:type="dxa" w:w="2880"/>
+          </w:tcPr>
+          <w:p>
+            <w:r>
+              <w:t>Q13 (what you'd never hand over)</w:t>
+            </w:r>
+          </w:p>
+        </w:tc>
+        <w:tc>
+          <w:tcPr>
+            <w:tcW w:type="dxa" w:w="2880"/>
+          </w:tcPr>
+          <w:p>
+            <w:r>
+              <w:t>A direct, low-cost version of the personal-boundary question</w:t>
+            </w:r>
+          </w:p>
+        </w:tc>
+        <w:tc>
+          <w:tcPr>
+            <w:tcW w:type="dxa" w:w="2880"/>
+          </w:tcPr>
+          <w:p>
+            <w:r>
+              <w:t>Q8 personal boundary, Payments &amp; Authorisation spend-cap design</w:t>
+            </w:r>
+          </w:p>
+        </w:tc>
+      </w:tr>
+      <w:tr>
+        <w:tc>
+          <w:tcPr>
+            <w:tcW w:type="dxa" w:w="2880"/>
+          </w:tcPr>
+          <w:p>
+            <w:r>
+              <w:t>Q14-Q17 (demographics)</w:t>
+            </w:r>
+          </w:p>
+        </w:tc>
+        <w:tc>
+          <w:tcPr>
+            <w:tcW w:type="dxa" w:w="2880"/>
+          </w:tcPr>
+          <w:p>
+            <w:r>
+              <w:t>Segment cross-tabs only — age, gender, home situation (a light renter/owner proxy), city</w:t>
+            </w:r>
+          </w:p>
+        </w:tc>
+        <w:tc>
+          <w:tcPr>
+            <w:tcW w:type="dxa" w:w="2880"/>
+          </w:tcPr>
+          <w:p>
+            <w:r>
+              <w:t>Honest scope disclosure, cross-tabbing all of the above</w:t>
             </w:r>
           </w:p>
         </w:tc>
@@ -2057,7 +739,799 @@
           <w:color w:val="555555"/>
           <w:sz w:val="20"/>
         </w:rPr>
-        <w:t>Full pilot transcripts and critiques are preserved in the team's working files as process evidence, alongside the interview guide's own three simulation transcripts.</w:t>
+        <w:t>Anything from the earlier draft that isn't in this table was cut for exactly that reason — it didn't clearly move one of these answers, or it duplicated something the team's live interviews already cover better.</w:t>
+      </w:r>
+    </w:p>
+    <w:p>
+      <w:r>
+        <w:br w:type="page"/>
+      </w:r>
+    </w:p>
+    <w:p>
+      <w:pPr>
+        <w:pStyle w:val="Heading1"/>
+      </w:pPr>
+      <w:r>
+        <w:t>Part 3 — Screening: keeping the data honest without adding friction</w:t>
+      </w:r>
+    </w:p>
+    <w:p>
+      <w:r>
+        <w:t>A survey link shared in WhatsApp groups can travel further than intended, and a longer screening process trades data quality for completions — exactly the tradeoff this redesign is trying to get right. The approach here is deliberately light:</w:t>
+      </w:r>
+    </w:p>
+    <w:p>
+      <w:pPr>
+        <w:pStyle w:val="ListBullet"/>
+      </w:pPr>
+      <w:r>
+        <w:t>Q1 is the only real eligibility gate. Anyone who answers No or Not sure skips straight to the four demographic questions and the end — they still count as a response (useful for an overall eligibility rate), but never generate incident data that would need to be trusted.</w:t>
+      </w:r>
+    </w:p>
+    <w:p>
+      <w:pPr>
+        <w:pStyle w:val="ListBullet"/>
+      </w:pPr>
+      <w:r>
+        <w:t>No location-verification step, no named-community field, and no city restriction — these were part of the earlier, city-specific draft and are deliberately removed. City (Q17) is collected only for honest scope disclosure when reporting results, not as a screening mechanism.</w:t>
+      </w:r>
+    </w:p>
+    <w:p>
+      <w:pPr>
+        <w:pStyle w:val="ListBullet"/>
+      </w:pPr>
+      <w:r>
+        <w:t>Duplicate or low-quality responses are handled after collection, not during it: sort by timestamp and flag unusually tight bursts of near-identical answers, flag any response that completes the whole form implausibly fast, and flag any open-text answer that exactly duplicates another response's. Keep a short exclusion log rather than silently deleting anything.</w:t>
+      </w:r>
+    </w:p>
+    <w:p>
+      <w:pPr>
+        <w:pStyle w:val="ListBullet"/>
+      </w:pPr>
+      <w:r>
+        <w:t>Deliberately not using Google Forms' "Limit to 1 response" (which requires Google sign-in) — it would break the anonymity promise in the form description and reduce response rates in exactly the WhatsApp-forwarded context this is built for.</w:t>
+      </w:r>
+    </w:p>
+    <w:p>
+      <w:r>
+        <w:br w:type="page"/>
+      </w:r>
+    </w:p>
+    <w:p>
+      <w:pPr>
+        <w:pStyle w:val="Heading1"/>
+      </w:pPr>
+      <w:r>
+        <w:t>Part 4 — The WhatsApp message to circulate</w:t>
+      </w:r>
+    </w:p>
+    <w:p>
+      <w:r>
+        <w:t>Paste this into any community/apartment/resident WhatsApp group — it names no specific city, so the same message works everywhere.</w:t>
+      </w:r>
+    </w:p>
+    <w:p>
+      <w:pPr>
+        <w:spacing w:after="160"/>
+        <w:ind w:left="432"/>
+      </w:pPr>
+      <w:r>
+        <w:rPr>
+          <w:i/>
+          <w:color w:val="1F2A44"/>
+          <w:sz w:val="22"/>
+        </w:rPr>
+        <w:t>“Hi everyone! We're a student team researching how Indian families handle getting things repaired or serviced at home — things like the AC, fridge, washing machine, geyser, water purifier, and so on.</w:t>
+        <w:br/>
+        <w:br/>
+        <w:t>We'd really appreciate 3-4 minutes of your time to fill this out: [FORM LINK HERE]</w:t>
+        <w:br/>
+        <w:br/>
+        <w:t>A few quick things before you click:</w:t>
+        <w:br/>
+        <w:t>- It's completely anonymous. We don't ask for your name — only your rough age group and city.</w:t>
+        <w:br/>
+        <w:t>- It's voluntary. Feel free to skip any question, or stop anytime.</w:t>
+        <w:br/>
+        <w:t>- We are NOT selling anything, and we will NEVER ask for money, OTP, or bank details.</w:t>
+        <w:br/>
+        <w:t>- This is for a genuine student research project (a national case competition), not a company or marketing survey.</w:t>
+        <w:br/>
+        <w:br/>
+        <w:t>If anyone else would be willing to fill it out too, please do forward this along — the more responses, the better our study.</w:t>
+        <w:br/>
+        <w:br/>
+        <w:t>Thank you so much!</w:t>
+        <w:br/>
+        <w:t>— [Your name], on behalf of Team Invictus, IIIT Hyderabad”</w:t>
+      </w:r>
+    </w:p>
+    <w:p>
+      <w:r>
+        <w:rPr>
+          <w:b/>
+        </w:rPr>
+        <w:t xml:space="preserve">Optional shorter reminder, a few days later: </w:t>
+      </w:r>
+    </w:p>
+    <w:p>
+      <w:pPr>
+        <w:spacing w:after="160"/>
+        <w:ind w:left="432"/>
+      </w:pPr>
+      <w:r>
+        <w:rPr>
+          <w:i/>
+          <w:color w:val="1F2A44"/>
+          <w:sz w:val="22"/>
+        </w:rPr>
+        <w:t>“Hi again — a gentle reminder about the short survey on household repairs/servicing we shared earlier: [FORM LINK HERE]. About 3-4 minutes, fully anonymous. Thank you to everyone who's already filled it out!”</w:t>
+      </w:r>
+    </w:p>
+    <w:p>
+      <w:r>
+        <w:rPr>
+          <w:b/>
+        </w:rPr>
+        <w:t xml:space="preserve">Notes on posting: </w:t>
+      </w:r>
+    </w:p>
+    <w:p>
+      <w:pPr>
+        <w:pStyle w:val="ListBullet"/>
+      </w:pPr>
+      <w:r>
+        <w:t>Post it yourself, or ask a resident you know in the group to post it — a message from a known, trusted resident is taken far more seriously than one from an unfamiliar number.</w:t>
+      </w:r>
+    </w:p>
+    <w:p>
+      <w:pPr>
+        <w:pStyle w:val="ListBullet"/>
+      </w:pPr>
+      <w:r>
+        <w:t>If the group requires admin approval for links, give the admin a one-line heads-up first.</w:t>
+      </w:r>
+    </w:p>
+    <w:p>
+      <w:pPr>
+        <w:pStyle w:val="ListBullet"/>
+      </w:pPr>
+      <w:r>
+        <w:t>Works in any resident/community group, in any city — nothing about this message or the form itself needs to change per location.</w:t>
+      </w:r>
+    </w:p>
+    <w:p>
+      <w:r>
+        <w:br w:type="page"/>
+      </w:r>
+    </w:p>
+    <w:p>
+      <w:pPr>
+        <w:pStyle w:val="Heading1"/>
+      </w:pPr>
+      <w:r>
+        <w:t>Part 5 — The Google Form, exactly as to build it</w:t>
+      </w:r>
+    </w:p>
+    <w:p>
+      <w:r>
+        <w:t>17 questions total. Copy directly into Google Forms.</w:t>
+      </w:r>
+    </w:p>
+    <w:p>
+      <w:pPr>
+        <w:pStyle w:val="Heading2"/>
+      </w:pPr>
+      <w:r>
+        <w:t>Consent (a single checkbox, not a separate question)</w:t>
+      </w:r>
+    </w:p>
+    <w:p>
+      <w:pPr>
+        <w:ind w:left="432"/>
+      </w:pPr>
+      <w:r>
+        <w:rPr>
+          <w:i/>
+          <w:color w:val="555555"/>
+          <w:sz w:val="20"/>
+        </w:rPr>
+        <w:t>Directly under the form description, add one required checkbox item, not a multiple-choice question: “I am 18 or older, and I agree to answer this survey voluntarily and anonymously.” Combining age and consent into one gate removes two full screens from every respondent's path.</w:t>
+      </w:r>
+    </w:p>
+    <w:p>
+      <w:pPr>
+        <w:pStyle w:val="Heading2"/>
+      </w:pPr>
+      <w:r>
+        <w:t>Form description</w:t>
+      </w:r>
+    </w:p>
+    <w:p>
+      <w:pPr>
+        <w:spacing w:after="160"/>
+        <w:ind w:left="432"/>
+      </w:pPr>
+      <w:r>
+        <w:rPr>
+          <w:i/>
+          <w:color w:val="1F2A44"/>
+          <w:sz w:val="22"/>
+        </w:rPr>
+        <w:t>“Hi! We're a student team researching how Indian families handle getting things repaired or serviced at home — the AC, fridge, washing machine, geyser, water purifier, and so on. This takes about 3-4 minutes. It's anonymous (we only keep your rough age group and city, never your name), voluntary, and we're not selling anything — we'll never ask for money, OTPs, or bank details. Your anonymised answers may be used in a student case-competition submission (The Ken 2026).</w:t>
+        <w:br/>
+        <w:t>Questions? [insert a real contact before launch].”</w:t>
+      </w:r>
+    </w:p>
+    <w:p>
+      <w:pPr>
+        <w:pStyle w:val="Heading2"/>
+      </w:pPr>
+      <w:r>
+        <w:t>SECTION 1 — Quick check</w:t>
+      </w:r>
+    </w:p>
+    <w:p>
+      <w:r>
+        <w:rPr>
+          <w:b/>
+        </w:rPr>
+        <w:t xml:space="preserve">Q1. </w:t>
+      </w:r>
+      <w:r>
+        <w:rPr>
+          <w:i/>
+          <w:color w:val="1F2A44"/>
+        </w:rPr>
+        <w:t>“In the last 3 months, did you personally help arrange a repair, service, or installation for any home appliance (AC, fridge, washing machine, geyser, water purifier, or similar)?”</w:t>
+      </w:r>
+    </w:p>
+    <w:p>
+      <w:r>
+        <w:rPr>
+          <w:i/>
+          <w:color w:val="8A1F2B"/>
+          <w:sz w:val="20"/>
+        </w:rPr>
+        <w:t>Type: Multiple choice. Options: Yes / No / Not sure.</w:t>
+      </w:r>
+    </w:p>
+    <w:p>
+      <w:r>
+        <w:rPr>
+          <w:i/>
+          <w:color w:val="8A1F2B"/>
+          <w:sz w:val="20"/>
+        </w:rPr>
+        <w:t>Branching: No/Not sure — skip to Section 4 (About you), then end.</w:t>
+      </w:r>
+    </w:p>
+    <w:p>
+      <w:pPr>
+        <w:pStyle w:val="Heading2"/>
+      </w:pPr>
+      <w:r>
+        <w:t>SECTION 2 — The most recent time</w:t>
+      </w:r>
+    </w:p>
+    <w:p>
+      <w:pPr>
+        <w:ind w:left="432"/>
+      </w:pPr>
+      <w:r>
+        <w:rPr>
+          <w:i/>
+          <w:color w:val="555555"/>
+          <w:sz w:val="20"/>
+        </w:rPr>
+        <w:t>Intro text: Think of the most recent time this happened, in the last 3 months. Keep that one time in mind for the next few questions.</w:t>
+      </w:r>
+    </w:p>
+    <w:p>
+      <w:r>
+        <w:rPr>
+          <w:b/>
+        </w:rPr>
+        <w:t xml:space="preserve">Q2. </w:t>
+      </w:r>
+      <w:r>
+        <w:rPr>
+          <w:i/>
+          <w:color w:val="1F2A44"/>
+        </w:rPr>
+        <w:t>“Which appliance or service was this about?”</w:t>
+      </w:r>
+    </w:p>
+    <w:p>
+      <w:r>
+        <w:rPr>
+          <w:i/>
+          <w:color w:val="8A1F2B"/>
+          <w:sz w:val="20"/>
+        </w:rPr>
+        <w:t>Type: Multiple choice, Other free text. Options: AC / Fridge / Washing machine / Water purifier / Geyser / Other kitchen appliance / Other home service (plumbing, electrical, pest control) / Other.</w:t>
+      </w:r>
+    </w:p>
+    <w:p>
+      <w:r>
+        <w:rPr>
+          <w:b/>
+        </w:rPr>
+        <w:t xml:space="preserve">Q3. </w:t>
+      </w:r>
+      <w:r>
+        <w:rPr>
+          <w:i/>
+          <w:color w:val="1F2A44"/>
+        </w:rPr>
+        <w:t>“What was the situation?”</w:t>
+      </w:r>
+    </w:p>
+    <w:p>
+      <w:r>
+        <w:rPr>
+          <w:i/>
+          <w:color w:val="8A1F2B"/>
+          <w:sz w:val="20"/>
+        </w:rPr>
+        <w:t>Type: Multiple choice, Other free text. Options: It stopped working completely / It wasn't working as well as before / New installation / Routine maintenance or top-up, nothing broken / Following up on an earlier repair / Other.</w:t>
+      </w:r>
+    </w:p>
+    <w:p>
+      <w:r>
+        <w:rPr>
+          <w:b/>
+        </w:rPr>
+        <w:t xml:space="preserve">Q4. </w:t>
+      </w:r>
+      <w:r>
+        <w:rPr>
+          <w:i/>
+          <w:color w:val="1F2A44"/>
+        </w:rPr>
+        <w:t>“How did you first get in touch with whoever helped?”</w:t>
+      </w:r>
+    </w:p>
+    <w:p>
+      <w:r>
+        <w:rPr>
+          <w:i/>
+          <w:color w:val="8A1F2B"/>
+          <w:sz w:val="20"/>
+        </w:rPr>
+        <w:t>Type: Multiple choice, Other free text. Options: Called a technician I already knew / Called the brand's service centre / Used an app (like Urban Company, Housejoy) / Through my building/society office, or a resident group recommendation / Asked a local shop / Other.</w:t>
+      </w:r>
+    </w:p>
+    <w:p>
+      <w:r>
+        <w:rPr>
+          <w:b/>
+        </w:rPr>
+        <w:t xml:space="preserve">Q5. </w:t>
+      </w:r>
+      <w:r>
+        <w:rPr>
+          <w:i/>
+          <w:color w:val="1F2A44"/>
+        </w:rPr>
+        <w:t>“Does your building/society have a shared maintenance office you can raise a request with, or does everyone arrange things on their own?”</w:t>
+      </w:r>
+    </w:p>
+    <w:p>
+      <w:r>
+        <w:rPr>
+          <w:i/>
+          <w:color w:val="8A1F2B"/>
+          <w:sz w:val="20"/>
+        </w:rPr>
+        <w:t>Type: Multiple choice. Options: Yes, a shared office or approved list / No, everyone arranges it themselves / A bit of both / Not sure / Not applicable (independent house).</w:t>
+      </w:r>
+    </w:p>
+    <w:p>
+      <w:r>
+        <w:rPr>
+          <w:b/>
+        </w:rPr>
+        <w:t xml:space="preserve">Q6. </w:t>
+      </w:r>
+      <w:r>
+        <w:t>(Grid/matrix question — one screen, four quick taps) “For this specific time, who was mainly responsible for each of these?”</w:t>
+      </w:r>
+    </w:p>
+    <w:p>
+      <w:r>
+        <w:rPr>
+          <w:i/>
+          <w:color w:val="8A1F2B"/>
+          <w:sz w:val="20"/>
+        </w:rPr>
+        <w:t>Type: Multiple-choice grid.</w:t>
+      </w:r>
+    </w:p>
+    <w:p>
+      <w:r>
+        <w:rPr>
+          <w:i/>
+          <w:color w:val="8A1F2B"/>
+          <w:sz w:val="20"/>
+        </w:rPr>
+        <w:t>Rows: Deciding to go ahead with the repair / Approving the cost, if it came up / Paying for it / Letting the technician into the home.</w:t>
+      </w:r>
+    </w:p>
+    <w:p>
+      <w:r>
+        <w:rPr>
+          <w:i/>
+          <w:color w:val="8A1F2B"/>
+          <w:sz w:val="20"/>
+        </w:rPr>
+        <w:t>Columns: Me / Another household member / Landlord or building office / Someone else / Not applicable.</w:t>
+      </w:r>
+    </w:p>
+    <w:p>
+      <w:pPr>
+        <w:ind w:left="432"/>
+      </w:pPr>
+      <w:r>
+        <w:rPr>
+          <w:i/>
+          <w:color w:val="555555"/>
+          <w:sz w:val="20"/>
+        </w:rPr>
+        <w:t>Build this as one native Google Forms “Multiple choice grid” question, not four separate questions — this is the single question that replaces what used to be four chained sub-questions in the earlier draft.</w:t>
+      </w:r>
+    </w:p>
+    <w:p>
+      <w:r>
+        <w:rPr>
+          <w:b/>
+        </w:rPr>
+        <w:t xml:space="preserve">Q7. </w:t>
+      </w:r>
+      <w:r>
+        <w:rPr>
+          <w:i/>
+          <w:color w:val="1F2A44"/>
+        </w:rPr>
+        <w:t>“Was a specific date or time promised for the work, and was it kept?”</w:t>
+      </w:r>
+    </w:p>
+    <w:p>
+      <w:r>
+        <w:rPr>
+          <w:i/>
+          <w:color w:val="8A1F2B"/>
+          <w:sz w:val="20"/>
+        </w:rPr>
+        <w:t>Type: Multiple choice. Options: Yes, and it was kept / Yes, but it wasn't kept / No clear time was given / Don't remember.</w:t>
+      </w:r>
+    </w:p>
+    <w:p>
+      <w:r>
+        <w:rPr>
+          <w:b/>
+        </w:rPr>
+        <w:t xml:space="preserve">Q8. </w:t>
+      </w:r>
+      <w:r>
+        <w:rPr>
+          <w:i/>
+          <w:color w:val="1F2A44"/>
+        </w:rPr>
+        <w:t>“After your first contact, did you need to follow up more than once before it was resolved?”</w:t>
+      </w:r>
+    </w:p>
+    <w:p>
+      <w:r>
+        <w:rPr>
+          <w:i/>
+          <w:color w:val="8A1F2B"/>
+          <w:sz w:val="20"/>
+        </w:rPr>
+        <w:t>Type: Multiple choice. Options: No, resolved after first contact / Yes, 1-2 more times / Yes, 3 or more times / Don't remember.</w:t>
+      </w:r>
+    </w:p>
+    <w:p>
+      <w:r>
+        <w:rPr>
+          <w:b/>
+        </w:rPr>
+        <w:t xml:space="preserve">Q9. </w:t>
+      </w:r>
+      <w:r>
+        <w:rPr>
+          <w:i/>
+          <w:color w:val="1F2A44"/>
+        </w:rPr>
+        <w:t>“Did any part, or the whole appliance, need to be picked up or delivered from somewhere else?”</w:t>
+      </w:r>
+    </w:p>
+    <w:p>
+      <w:r>
+        <w:rPr>
+          <w:i/>
+          <w:color w:val="8A1F2B"/>
+          <w:sz w:val="20"/>
+        </w:rPr>
+        <w:t>Type: Multiple choice. Options: Yes / No / Not sure.</w:t>
+      </w:r>
+    </w:p>
+    <w:p>
+      <w:r>
+        <w:rPr>
+          <w:b/>
+        </w:rPr>
+        <w:t xml:space="preserve">Q10. </w:t>
+      </w:r>
+      <w:r>
+        <w:rPr>
+          <w:i/>
+          <w:color w:val="1F2A44"/>
+        </w:rPr>
+        <w:t>“How do you usually keep track of servicing dates, warranty, or technician numbers? (Select all that apply)”</w:t>
+      </w:r>
+    </w:p>
+    <w:p>
+      <w:r>
+        <w:rPr>
+          <w:i/>
+          <w:color w:val="8A1F2B"/>
+          <w:sz w:val="20"/>
+        </w:rPr>
+        <w:t>Type: Checkboxes. Options: A saved contact in my phone / A note, list, or notebook / A WhatsApp chat / We have an AMC or annual contract / I don't track it, I just call when needed / Other.</w:t>
+      </w:r>
+    </w:p>
+    <w:p>
+      <w:r>
+        <w:rPr>
+          <w:b/>
+        </w:rPr>
+        <w:t xml:space="preserve">Q11. </w:t>
+      </w:r>
+      <w:r>
+        <w:rPr>
+          <w:i/>
+          <w:color w:val="1F2A44"/>
+        </w:rPr>
+        <w:t>“Overall, how much effort or hassle did this take for you?”</w:t>
+      </w:r>
+    </w:p>
+    <w:p>
+      <w:r>
+        <w:rPr>
+          <w:i/>
+          <w:color w:val="8A1F2B"/>
+          <w:sz w:val="20"/>
+        </w:rPr>
+        <w:t>Type: Multiple choice. Options: Very little / A little / A moderate amount / A lot / A huge amount.</w:t>
+      </w:r>
+    </w:p>
+    <w:p>
+      <w:pPr>
+        <w:pStyle w:val="Heading2"/>
+      </w:pPr>
+      <w:r>
+        <w:t>SECTION 3 — In your own words (both optional, but genuinely valuable)</w:t>
+      </w:r>
+    </w:p>
+    <w:p>
+      <w:r>
+        <w:rPr>
+          <w:b/>
+        </w:rPr>
+        <w:t xml:space="preserve">Q12. </w:t>
+      </w:r>
+      <w:r>
+        <w:rPr>
+          <w:i/>
+          <w:color w:val="1F2A44"/>
+        </w:rPr>
+        <w:t>“Has there been a small repair or issue at home that you just never got around to calling anyone about, or handled some other way instead of calling a professional? Briefly, what happened?”</w:t>
+      </w:r>
+    </w:p>
+    <w:p>
+      <w:r>
+        <w:rPr>
+          <w:i/>
+          <w:color w:val="8A1F2B"/>
+          <w:sz w:val="20"/>
+        </w:rPr>
+        <w:t>Type: Paragraph, optional.</w:t>
+      </w:r>
+    </w:p>
+    <w:p>
+      <w:r>
+        <w:rPr>
+          <w:b/>
+        </w:rPr>
+        <w:t xml:space="preserve">Q13. </w:t>
+      </w:r>
+      <w:r>
+        <w:rPr>
+          <w:i/>
+          <w:color w:val="1F2A44"/>
+        </w:rPr>
+        <w:t>“If a trusted person or service could handle this entire process for you next time, what's the one thing you'd always want to decide or approve yourself?”</w:t>
+      </w:r>
+    </w:p>
+    <w:p>
+      <w:r>
+        <w:rPr>
+          <w:i/>
+          <w:color w:val="8A1F2B"/>
+          <w:sz w:val="20"/>
+        </w:rPr>
+        <w:t>Type: Short answer, optional.</w:t>
+      </w:r>
+    </w:p>
+    <w:p>
+      <w:pPr>
+        <w:pStyle w:val="Heading2"/>
+      </w:pPr>
+      <w:r>
+        <w:t>SECTION 4 — About you (shown to everyone, including those screened out at Q1)</w:t>
+      </w:r>
+    </w:p>
+    <w:p>
+      <w:r>
+        <w:rPr>
+          <w:b/>
+        </w:rPr>
+        <w:t xml:space="preserve">Q14. </w:t>
+      </w:r>
+      <w:r>
+        <w:rPr>
+          <w:i/>
+          <w:color w:val="1F2A44"/>
+        </w:rPr>
+        <w:t>“What is your age group?”</w:t>
+      </w:r>
+    </w:p>
+    <w:p>
+      <w:r>
+        <w:rPr>
+          <w:i/>
+          <w:color w:val="8A1F2B"/>
+          <w:sz w:val="20"/>
+        </w:rPr>
+        <w:t>Type: Multiple choice. Options: 18-24 / 25-34 / 35-44 / 45-54 / 55-64 / 65 or older / Prefer not to say.</w:t>
+      </w:r>
+    </w:p>
+    <w:p>
+      <w:r>
+        <w:rPr>
+          <w:b/>
+        </w:rPr>
+        <w:t xml:space="preserve">Q15. </w:t>
+      </w:r>
+      <w:r>
+        <w:rPr>
+          <w:i/>
+          <w:color w:val="1F2A44"/>
+        </w:rPr>
+        <w:t>“Which of these best describes you?”</w:t>
+      </w:r>
+    </w:p>
+    <w:p>
+      <w:r>
+        <w:rPr>
+          <w:i/>
+          <w:color w:val="8A1F2B"/>
+          <w:sz w:val="20"/>
+        </w:rPr>
+        <w:t>Type: Multiple choice. Options: Woman / Man / Prefer to self-describe / Prefer not to say.</w:t>
+      </w:r>
+    </w:p>
+    <w:p>
+      <w:r>
+        <w:rPr>
+          <w:b/>
+        </w:rPr>
+        <w:t xml:space="preserve">Q16. </w:t>
+      </w:r>
+      <w:r>
+        <w:rPr>
+          <w:i/>
+          <w:color w:val="1F2A44"/>
+        </w:rPr>
+        <w:t>“Which of these best describes your home?”</w:t>
+      </w:r>
+    </w:p>
+    <w:p>
+      <w:r>
+        <w:rPr>
+          <w:i/>
+          <w:color w:val="8A1F2B"/>
+          <w:sz w:val="20"/>
+        </w:rPr>
+        <w:t>Type: Multiple choice, Other free text. Options: Own home / Rented / Living with family / PG or shared accommodation / Other.</w:t>
+      </w:r>
+    </w:p>
+    <w:p>
+      <w:r>
+        <w:rPr>
+          <w:b/>
+        </w:rPr>
+        <w:t xml:space="preserve">Q17. </w:t>
+      </w:r>
+      <w:r>
+        <w:rPr>
+          <w:i/>
+          <w:color w:val="1F2A44"/>
+        </w:rPr>
+        <w:t>“Which city do you live in?”</w:t>
+      </w:r>
+    </w:p>
+    <w:p>
+      <w:r>
+        <w:rPr>
+          <w:i/>
+          <w:color w:val="8A1F2B"/>
+          <w:sz w:val="20"/>
+        </w:rPr>
+        <w:t>Type: Short answer (free text, any city).</w:t>
+      </w:r>
+    </w:p>
+    <w:p>
+      <w:pPr>
+        <w:pStyle w:val="Heading2"/>
+      </w:pPr>
+      <w:r>
+        <w:t>Closing screen</w:t>
+      </w:r>
+    </w:p>
+    <w:p>
+      <w:pPr>
+        <w:spacing w:after="160"/>
+        <w:ind w:left="432"/>
+      </w:pPr>
+      <w:r>
+        <w:rPr>
+          <w:i/>
+          <w:color w:val="1F2A44"/>
+          <w:sz w:val="22"/>
+        </w:rPr>
+        <w:t>“Thank you! If you'd be open to a short follow-up conversation (completely optional), leave your contact here: [separate optional link] — nobody will contact you unless you fill this in yourself.”</w:t>
+      </w:r>
+    </w:p>
+    <w:p>
+      <w:pPr>
+        <w:pStyle w:val="Heading2"/>
+      </w:pPr>
+      <w:r>
+        <w:t>Google Forms build notes</w:t>
+      </w:r>
+    </w:p>
+    <w:p>
+      <w:pPr>
+        <w:pStyle w:val="ListBullet"/>
+      </w:pPr>
+      <w:r>
+        <w:t>The consent checkbox goes directly under the description, marked required, before Q1.</w:t>
+      </w:r>
+    </w:p>
+    <w:p>
+      <w:pPr>
+        <w:pStyle w:val="ListBullet"/>
+      </w:pPr>
+      <w:r>
+        <w:t>Q6 must be built as a native “Multiple choice grid” question — do not split it into four separate questions.</w:t>
+      </w:r>
+    </w:p>
+    <w:p>
+      <w:pPr>
+        <w:pStyle w:val="ListBullet"/>
+      </w:pPr>
+      <w:r>
+        <w:t>Branching: Q1 (No/Not sure) — Section 4 — end. Every other question is linear, no other skips needed — this is deliberate: the five separate conditional branches in the earlier draft are gone because the questions that needed them were cut.</w:t>
+      </w:r>
+    </w:p>
+    <w:p>
+      <w:pPr>
+        <w:pStyle w:val="ListBullet"/>
+      </w:pPr>
+      <w:r>
+        <w:t>Turn OFF “Shuffle question order” and OFF “Limit to 1 response” — same reasoning as before: anonymity over forced sign-in, catch duplicates at analysis time instead (Part 3).</w:t>
       </w:r>
     </w:p>
     <w:p>
@@ -2078,7 +1552,7 @@
         <w:pStyle w:val="ListBullet"/>
       </w:pPr>
       <w:r>
-        <w:t>Replace every [placeholder] — the real contact in the form description, the real form link in the WhatsApp message, and the real opt-in interview link at the end — before sending anything.</w:t>
+        <w:t>Replace every [placeholder] — the real contact in the form description, the real form link in the WhatsApp message, and the real opt-in interview link at the end.</w:t>
       </w:r>
     </w:p>
     <w:p>
@@ -2086,7 +1560,7 @@
         <w:pStyle w:val="ListBullet"/>
       </w:pPr>
       <w:r>
-        <w:t>Build the branching exactly as noted in Part 4's build notes; test the flow yourself once, end to end, including at least one path through each conditional question, before sharing the link anywhere.</w:t>
+        <w:t>Build Q6 as a grid and confirm the one real branch (Q1 — Section 4) works before sharing the link anywhere.</w:t>
       </w:r>
     </w:p>
     <w:p>
@@ -2094,7 +1568,7 @@
         <w:pStyle w:val="ListBullet"/>
       </w:pPr>
       <w:r>
-        <w:t>Set responses to save to a Google Sheet, and keep the Q25a description field readable alongside the rest — no separate contact field is collected in this version, so there is nothing extra to split out at export time.</w:t>
+        <w:t>Set responses to save to a Google Sheet.</w:t>
       </w:r>
     </w:p>
     <w:p>
@@ -2102,7 +1576,7 @@
         <w:pStyle w:val="ListBullet"/>
       </w:pPr>
       <w:r>
-        <w:t>Post into Hyderabad and Visakhapatnam gated-community WhatsApp groups via a known, trusted resident where possible, per Part 3's notes.</w:t>
+        <w:t>Post into any resident/community WhatsApp group — no city-specific tailoring needed.</w:t>
       </w:r>
     </w:p>
     <w:p>
@@ -2110,7 +1584,7 @@
         <w:pStyle w:val="ListBullet"/>
       </w:pPr>
       <w:r>
-        <w:t>After a few days: run the Part 2 duplicate/plausibility check before doing any analysis, and keep a short exclusion log of anything dropped and why.</w:t>
+        <w:t>After a few days: run the Part 3 duplicate/plausibility check before doing any analysis, and keep a short exclusion log of anything dropped and why.</w:t>
       </w:r>
     </w:p>
     <w:p>
@@ -2131,324 +1605,57 @@
         <w:pStyle w:val="Heading1"/>
       </w:pPr>
       <w:r>
-        <w:t>Appendix — Quantitative vs. qualitative map, and the two pilot personas</w:t>
+        <w:t>Appendix — What the earlier draft's pilot tests taught us that still applies</w:t>
+      </w:r>
+    </w:p>
+    <w:p>
+      <w:r>
+        <w:t>Before this redesign, the longer 33-question draft was pressure-tested with two simulated respondents (a less digitally-fluent homemaker, and a more app-comfortable homemaker whose most recent incident was genuinely ambiguous between two candidate machines in the same week). Several of their findings are still load-bearing in this shorter version, even though the specific questions they were testing have since been cut or merged:</w:t>
       </w:r>
     </w:p>
     <w:p>
       <w:pPr>
-        <w:pStyle w:val="Heading2"/>
+        <w:pStyle w:val="ListBullet"/>
       </w:pPr>
       <w:r>
-        <w:t>What each part of the survey is actually collecting</w:t>
-      </w:r>
-    </w:p>
-    <w:tbl>
-      <w:tblPr>
-        <w:tblStyle w:val="LightGrid-Accent1"/>
-        <w:tblW w:type="auto" w:w="0"/>
-        <w:tblLook w:firstColumn="1" w:firstRow="1" w:lastColumn="0" w:lastRow="0" w:noHBand="0" w:noVBand="1" w:val="04A0"/>
-      </w:tblPr>
-      <w:tblGrid>
-        <w:gridCol w:w="2880"/>
-        <w:gridCol w:w="2880"/>
-        <w:gridCol w:w="2880"/>
-      </w:tblGrid>
-      <w:tr>
-        <w:tc>
-          <w:tcPr>
-            <w:tcW w:type="dxa" w:w="2880"/>
-          </w:tcPr>
-          <w:p>
-            <w:r>
-              <w:rPr>
-                <w:b/>
-              </w:rPr>
-              <w:t>Section</w:t>
-            </w:r>
-          </w:p>
-        </w:tc>
-        <w:tc>
-          <w:tcPr>
-            <w:tcW w:type="dxa" w:w="2880"/>
-          </w:tcPr>
-          <w:p>
-            <w:r>
-              <w:rPr>
-                <w:b/>
-              </w:rPr>
-              <w:t>Mostly quantitative (counted, compared)</w:t>
-            </w:r>
-          </w:p>
-        </w:tc>
-        <w:tc>
-          <w:tcPr>
-            <w:tcW w:type="dxa" w:w="2880"/>
-          </w:tcPr>
-          <w:p>
-            <w:r>
-              <w:rPr>
-                <w:b/>
-              </w:rPr>
-              <w:t>Mostly qualitative (read, coded by hand)</w:t>
-            </w:r>
-          </w:p>
-        </w:tc>
-      </w:tr>
-      <w:tr>
-        <w:tc>
-          <w:tcPr>
-            <w:tcW w:type="dxa" w:w="2880"/>
-          </w:tcPr>
-          <w:p>
-            <w:r>
-              <w:t>1 — Screening</w:t>
-            </w:r>
-          </w:p>
-        </w:tc>
-        <w:tc>
-          <w:tcPr>
-            <w:tcW w:type="dxa" w:w="2880"/>
-          </w:tcPr>
-          <w:p>
-            <w:r>
-              <w:t>Eligibility rates, coordinator-role self-report (Q5)</w:t>
-            </w:r>
-          </w:p>
-        </w:tc>
-        <w:tc>
-          <w:tcPr>
-            <w:tcW w:type="dxa" w:w="2880"/>
-          </w:tcPr>
-          <w:p>
-            <w:r>
-              <w:t>—</w:t>
-            </w:r>
-          </w:p>
-        </w:tc>
-      </w:tr>
-      <w:tr>
-        <w:tc>
-          <w:tcPr>
-            <w:tcW w:type="dxa" w:w="2880"/>
-          </w:tcPr>
-          <w:p>
-            <w:r>
-              <w:t>2 — Incident facts</w:t>
-            </w:r>
-          </w:p>
-        </w:tc>
-        <w:tc>
-          <w:tcPr>
-            <w:tcW w:type="dxa" w:w="2880"/>
-          </w:tcPr>
-          <w:p>
-            <w:r>
-              <w:t>Which appliance, why, when, ownership, channel (Q7-Q12)</w:t>
-            </w:r>
-          </w:p>
-        </w:tc>
-        <w:tc>
-          <w:tcPr>
-            <w:tcW w:type="dxa" w:w="2880"/>
-          </w:tcPr>
-          <w:p>
-            <w:r>
-              <w:t>Q13, the unprimed “what happened next”</w:t>
-            </w:r>
-          </w:p>
-        </w:tc>
-      </w:tr>
-      <w:tr>
-        <w:tc>
-          <w:tcPr>
-            <w:tcW w:type="dxa" w:w="2880"/>
-          </w:tcPr>
-          <w:p>
-            <w:r>
-              <w:t>3 — Effort and outcome</w:t>
-            </w:r>
-          </w:p>
-        </w:tc>
-        <w:tc>
-          <w:tcPr>
-            <w:tcW w:type="dxa" w:w="2880"/>
-          </w:tcPr>
-          <w:p>
-            <w:r>
-              <w:t>Follow-up count, time spent, status, restoration time, hassle rating (Q14-Q18)</w:t>
-            </w:r>
-          </w:p>
-        </w:tc>
-        <w:tc>
-          <w:tcPr>
-            <w:tcW w:type="dxa" w:w="2880"/>
-          </w:tcPr>
-          <w:p>
-            <w:r>
-              <w:t>Q19, the hardest-part story</w:t>
-            </w:r>
-          </w:p>
-        </w:tc>
-      </w:tr>
-      <w:tr>
-        <w:tc>
-          <w:tcPr>
-            <w:tcW w:type="dxa" w:w="2880"/>
-          </w:tcPr>
-          <w:p>
-            <w:r>
-              <w:t>4 — Who decided, who paid</w:t>
-            </w:r>
-          </w:p>
-        </w:tc>
-        <w:tc>
-          <w:tcPr>
-            <w:tcW w:type="dxa" w:w="2880"/>
-          </w:tcPr>
-          <w:p>
-            <w:r>
-              <w:t>Role for each of: proceed decision, price approval, payment, price change, logistics (Q20-Q24a)</w:t>
-            </w:r>
-          </w:p>
-        </w:tc>
-        <w:tc>
-          <w:tcPr>
-            <w:tcW w:type="dxa" w:w="2880"/>
-          </w:tcPr>
-          <w:p>
-            <w:r>
-              <w:t>Q23a, what happened when price changed</w:t>
-            </w:r>
-          </w:p>
-        </w:tc>
-      </w:tr>
-      <w:tr>
-        <w:tc>
-          <w:tcPr>
-            <w:tcW w:type="dxa" w:w="2880"/>
-          </w:tcPr>
-          <w:p>
-            <w:r>
-              <w:t>5 — Remembering</w:t>
-            </w:r>
-          </w:p>
-        </w:tc>
-        <w:tc>
-          <w:tcPr>
-            <w:tcW w:type="dxa" w:w="2880"/>
-          </w:tcPr>
-          <w:p>
-            <w:r>
-              <w:t>Record-keeping method, AMC status (Q25-Q26)</w:t>
-            </w:r>
-          </w:p>
-        </w:tc>
-        <w:tc>
-          <w:tcPr>
-            <w:tcW w:type="dxa" w:w="2880"/>
-          </w:tcPr>
-          <w:p>
-            <w:r>
-              <w:t>Q25a description, Q27 vehicle-reminder comparison</w:t>
-            </w:r>
-          </w:p>
-        </w:tc>
-      </w:tr>
-      <w:tr>
-        <w:tc>
-          <w:tcPr>
-            <w:tcW w:type="dxa" w:w="2880"/>
-          </w:tcPr>
-          <w:p>
-            <w:r>
-              <w:t>6 — In your own words</w:t>
-            </w:r>
-          </w:p>
-        </w:tc>
-        <w:tc>
-          <w:tcPr>
-            <w:tcW w:type="dxa" w:w="2880"/>
-          </w:tcPr>
-          <w:p>
-            <w:r>
-              <w:t>—</w:t>
-            </w:r>
-          </w:p>
-        </w:tc>
-        <w:tc>
-          <w:tcPr>
-            <w:tcW w:type="dxa" w:w="2880"/>
-          </w:tcPr>
-          <w:p>
-            <w:r>
-              <w:t>Q28 unreported small issue, Q29 delegation preference, Q30 catch-all</w:t>
-            </w:r>
-          </w:p>
-        </w:tc>
-      </w:tr>
-      <w:tr>
-        <w:tc>
-          <w:tcPr>
-            <w:tcW w:type="dxa" w:w="2880"/>
-          </w:tcPr>
-          <w:p>
-            <w:r>
-              <w:t>7 — About you</w:t>
-            </w:r>
-          </w:p>
-        </w:tc>
-        <w:tc>
-          <w:tcPr>
-            <w:tcW w:type="dxa" w:w="2880"/>
-          </w:tcPr>
-          <w:p>
-            <w:r>
-              <w:t>Age band, gender, home type (Q31-Q33)</w:t>
-            </w:r>
-          </w:p>
-        </w:tc>
-        <w:tc>
-          <w:tcPr>
-            <w:tcW w:type="dxa" w:w="2880"/>
-          </w:tcPr>
-          <w:p>
-            <w:r>
-              <w:t>—</w:t>
-            </w:r>
-          </w:p>
-        </w:tc>
-      </w:tr>
-    </w:tbl>
-    <w:p/>
-    <w:p>
-      <w:r>
-        <w:t>This mix is deliberate: the closed questions give comparable counts across dozens of responses (how common is each pattern, does it differ between Hyderabad and Visakhapatnam, between managed and self-arranged communities), while the open questions — especially Q28, which is explicitly designed to surface a problem the respondent never actually acted on — are where a genuinely surprising, non-obvious finding is most likely to show up, exactly the kind the competition's own Evidence criterion names directly (“what you found that you weren't looking for”).</w:t>
+        <w:t>Never use an acronym (like “AMC” or “PUC”) without spelling it out on first use — this version avoids the issue entirely by dropping the vehicle-reminder comparison question and spelling out “AMC” inline in Q10's options.</w:t>
       </w:r>
     </w:p>
     <w:p>
       <w:pPr>
-        <w:pStyle w:val="Heading2"/>
+        <w:pStyle w:val="ListBullet"/>
       </w:pPr>
       <w:r>
-        <w:t>Persona 1 (pilot test) — Lakshmi, 46, Hyderabad</w:t>
-      </w:r>
-    </w:p>
-    <w:p>
-      <w:r>
-        <w:t>Homemaker in an ordinary, non-premium 150-flat gated community; handles almost all household coordination; comfortable with WhatsApp but not deeply tech-savvy; functional but not fluent English; has never used a service app, always calls a known local technician found through word of mouth. Used to pretest plain-language comprehension and jargon sensitivity.</w:t>
+        <w:t>Don't force a breakdown narrative onto a routine, nothing-broken incident — Q3's options explicitly include “routine maintenance or top-up, nothing broken” for exactly this reason.</w:t>
       </w:r>
     </w:p>
     <w:p>
       <w:pPr>
-        <w:pStyle w:val="Heading2"/>
+        <w:pStyle w:val="ListBullet"/>
       </w:pPr>
       <w:r>
-        <w:t>Persona 2 (pilot test) — Sujatha, 38, Visakhapatnam</w:t>
+        <w:t>Don't silently bundle two different decisions into one question (who decided to proceed vs. who approved the price) — Q6's grid keeps every role as its own row instead of merging any of them.</w:t>
       </w:r>
     </w:p>
     <w:p>
+      <w:pPr>
+        <w:pStyle w:val="ListBullet"/>
+      </w:pPr>
       <w:r>
-        <w:t>Homemaker in a newer, mid-sized gated community; more fluent in English and more comfortable with apps (has used a service marketplace app once); her most recent real situation involved two separate, low-drama servicing events in the same week (an RO filter change and an AC gas top-up), both handled and paid for by her alone without any real friction. Used to pretest the “most recent time” framing and whether the survey's structure wrongly assumes drama or breakdown.</w:t>
+        <w:t>An explicit “if honestly nothing was difficult, that's a fine answer too” permission produces more honest answers than a question that quietly presupposes friction happened — Q11's full answer range (down to “Very little”) preserves this.</w:t>
+      </w:r>
+    </w:p>
+    <w:p>
+      <w:pPr>
+        <w:ind w:left="432"/>
+      </w:pPr>
+      <w:r>
+        <w:rPr>
+          <w:i/>
+          <w:color w:val="555555"/>
+          <w:sz w:val="20"/>
+        </w:rPr>
+        <w:t>Full transcripts of both original pilot tests are preserved in the team's working files (research/survey_guide_qa/) as process evidence, alongside this redesign's own reasoning.</w:t>
       </w:r>
     </w:p>
     <w:sectPr>

</xml_diff>